<commit_message>
Premium PDF/Word design, press section, news highlights, source packages
- Reports: cover band with verdict badge, numbered sections, aligned ESG checks,
  Carlito font (OFL), nicer tiles/tables/charts; Excel output removed
- 'In the press' section from news digest + analyst summaries for 8 issuers;
  media ESG item cites the news summary
- News page: 'Worth your attention' highlights; topic chips; sports noise filtered
- tools/archive_sources.py: ZIP of report sources to GitHub Release 'sources'

Co-Authored-By: Claude Opus 5.5 (1M context) <noreply@anthropic.com>
Claude-Session: https://claude.ai/code/session_013ZCssjCF43KM8LCnCdqfwt
</commit_message>
<xml_diff>
--- a/docs/files/nortal/nortal_FY2025_en.docx
+++ b/docs/files/nortal/nortal_FY2025_en.docx
@@ -2,112 +2,287 @@
 <file path=word/document.xml><?xml version="1.0" encoding="utf-8"?>
 <w:document xmlns:wpc="http://schemas.microsoft.com/office/word/2010/wordprocessingCanvas" xmlns:mo="http://schemas.microsoft.com/office/mac/office/2008/main" xmlns:mc="http://schemas.openxmlformats.org/markup-compatibility/2006" xmlns:mv="urn:schemas-microsoft-com:mac:vml" xmlns:o="urn:schemas-microsoft-com:office:office" xmlns:r="http://schemas.openxmlformats.org/officeDocument/2006/relationships" xmlns:m="http://schemas.openxmlformats.org/officeDocument/2006/math" xmlns:v="urn:schemas-microsoft-com:vml" xmlns:wp14="http://schemas.microsoft.com/office/word/2010/wordprocessingDrawing" xmlns:wp="http://schemas.openxmlformats.org/drawingml/2006/wordprocessingDrawing" xmlns:w10="urn:schemas-microsoft-com:office:word" xmlns:w="http://schemas.openxmlformats.org/wordprocessingml/2006/main" xmlns:w14="http://schemas.microsoft.com/office/word/2010/wordml" xmlns:wpg="http://schemas.microsoft.com/office/word/2010/wordprocessingGroup" xmlns:wpi="http://schemas.microsoft.com/office/word/2010/wordprocessingInk" xmlns:wne="http://schemas.microsoft.com/office/word/2006/wordml" xmlns:wps="http://schemas.microsoft.com/office/word/2010/wordprocessingShape" mc:Ignorable="w14 wp14">
   <w:body>
+    <w:tbl>
+      <w:tblPr>
+        <w:tblW w:w="9639" w:type="dxa"/>
+        <w:tblBorders>
+          <w:top w:val="nil"/>
+          <w:left w:val="nil"/>
+          <w:bottom w:val="nil"/>
+          <w:right w:val="nil"/>
+          <w:insideH w:val="nil"/>
+          <w:insideV w:val="nil"/>
+        </w:tblBorders>
+        <w:tblLayout w:type="fixed"/>
+        <w:tblCellMar>
+          <w:top w:w="260" w:type="dxa"/>
+          <w:left w:w="280" w:type="dxa"/>
+          <w:bottom w:w="260" w:type="dxa"/>
+          <w:right w:w="280" w:type="dxa"/>
+        </w:tblCellMar>
+        <w:tblLook w:firstColumn="1" w:firstRow="1" w:lastColumn="0" w:lastRow="0" w:noHBand="0" w:noVBand="1" w:val="04A0"/>
+      </w:tblPr>
+      <w:tblGrid>
+        <w:gridCol w:w="7030"/>
+        <w:gridCol w:w="2608"/>
+      </w:tblGrid>
+      <w:tr>
+        <w:tc>
+          <w:tcPr>
+            <w:tcW w:type="dxa" w:w="7030"/>
+            <w:shd w:val="clear" w:color="auto" w:fill="1F4E79"/>
+          </w:tcPr>
+          <w:p>
+            <w:pPr>
+              <w:spacing w:before="0" w:after="0"/>
+            </w:pPr>
+            <w:r>
+              <w:rPr>
+                <w:b/>
+                <w:caps/>
+                <w:color w:val="AFC6DD"/>
+                <w:sz w:val="17"/>
+              </w:rPr>
+              <w:t>Issuer review · FY2025</w:t>
+            </w:r>
+          </w:p>
+          <w:p>
+            <w:pPr>
+              <w:spacing w:before="40" w:after="0"/>
+            </w:pPr>
+            <w:r>
+              <w:rPr>
+                <w:b/>
+                <w:color w:val="FFFFFF"/>
+                <w:sz w:val="52"/>
+              </w:rPr>
+              <w:t>Nortal</w:t>
+            </w:r>
+          </w:p>
+        </w:tc>
+        <w:tc>
+          <w:tcPr>
+            <w:tcW w:type="dxa" w:w="2608"/>
+            <w:shd w:val="clear" w:color="auto" w:fill="1F4E79"/>
+          </w:tcPr>
+          <w:p>
+            <w:pPr>
+              <w:spacing w:before="280" w:after="0"/>
+              <w:jc w:val="right"/>
+            </w:pPr>
+            <w:r>
+              <w:rPr>
+                <w:b/>
+                <w:color w:val="9A6400"/>
+                <w:sz w:val="19"/>
+                <w:shd w:val="clear" w:color="auto" w:fill="FDF1D8"/>
+              </w:rPr>
+              <w:t xml:space="preserve">  ●  WATCH  </w:t>
+            </w:r>
+          </w:p>
+        </w:tc>
+      </w:tr>
+    </w:tbl>
     <w:p>
       <w:pPr>
-        <w:spacing w:after="0"/>
+        <w:pBdr>
+          <w:top w:val="single" w:sz="12" w:color="2A78D6" w:space="0"/>
+        </w:pBdr>
+        <w:spacing w:before="0" w:after="200" w:line="120" w:lineRule="auto"/>
       </w:pPr>
-      <w:r>
-        <w:rPr>
-          <w:b/>
-          <w:color w:val="1F4E79"/>
-          <w:sz w:val="48"/>
-        </w:rPr>
-        <w:t>Nortal</w:t>
-      </w:r>
-    </w:p>
-    <w:p>
-      <w:r>
-        <w:rPr>
-          <w:color w:val="5F6B7A"/>
-          <w:sz w:val="24"/>
-        </w:rPr>
-        <w:t>Issuer review · FY2025</w:t>
-      </w:r>
-    </w:p>
-    <w:p>
-      <w:pPr>
-        <w:spacing w:after="0"/>
-      </w:pPr>
-      <w:r>
-        <w:rPr>
-          <w:b/>
-          <w:sz w:val="19"/>
-        </w:rPr>
-        <w:t xml:space="preserve">Analysis date: </w:t>
-      </w:r>
-      <w:r>
-        <w:rPr>
-          <w:b w:val="0"/>
-          <w:sz w:val="19"/>
-        </w:rPr>
-        <w:t>2026-10-22</w:t>
-      </w:r>
-    </w:p>
-    <w:p>
-      <w:pPr>
-        <w:spacing w:after="0"/>
-      </w:pPr>
-      <w:r>
-        <w:rPr>
-          <w:b/>
-          <w:sz w:val="19"/>
-        </w:rPr>
-        <w:t xml:space="preserve">Rating: </w:t>
-      </w:r>
-      <w:r>
-        <w:rPr>
-          <w:b w:val="0"/>
-          <w:sz w:val="19"/>
-        </w:rPr>
-        <w:t>nerasta (no public credit rating found)</w:t>
-      </w:r>
-    </w:p>
-    <w:p>
-      <w:pPr>
-        <w:spacing w:after="0"/>
-      </w:pPr>
-      <w:r>
-        <w:rPr>
-          <w:b/>
-          <w:sz w:val="19"/>
-        </w:rPr>
-        <w:t xml:space="preserve">Next report: </w:t>
-      </w:r>
-      <w:r>
-        <w:rPr>
-          <w:b w:val="0"/>
-          <w:sz w:val="19"/>
-        </w:rPr>
-        <w:t>nerasta - Nortal reports are published only on its password-protected investor portal</w:t>
-      </w:r>
-      <w:hyperlink r:id="rId10">
-        <w:r>
-          <w:rPr>
-            <w:color w:val="2A78D6"/>
-            <w:vertAlign w:val="superscript"/>
-            <w:sz w:val="16"/>
-          </w:rPr>
-          <w:t xml:space="preserve">1</w:t>
-        </w:r>
-      </w:hyperlink>
     </w:p>
     <w:tbl>
       <w:tblPr>
-        <w:tblW w:type="auto" w:w="0"/>
+        <w:tblW w:w="9639" w:type="dxa"/>
+        <w:tblBorders>
+          <w:top w:val="nil"/>
+          <w:left w:val="nil"/>
+          <w:bottom w:val="nil"/>
+          <w:right w:val="nil"/>
+          <w:insideH w:val="nil"/>
+          <w:insideV w:val="nil"/>
+        </w:tblBorders>
+        <w:tblLayout w:type="fixed"/>
+        <w:tblCellMar>
+          <w:top w:w="0" w:type="dxa"/>
+          <w:left w:w="0" w:type="dxa"/>
+          <w:bottom w:w="120" w:type="dxa"/>
+          <w:right w:w="160" w:type="dxa"/>
+        </w:tblCellMar>
         <w:tblLook w:firstColumn="1" w:firstRow="1" w:lastColumn="0" w:lastRow="0" w:noHBand="0" w:noVBand="1" w:val="04A0"/>
       </w:tblPr>
       <w:tblGrid>
-        <w:gridCol w:w="9972"/>
+        <w:gridCol w:w="3213"/>
+        <w:gridCol w:w="3213"/>
+        <w:gridCol w:w="3213"/>
+      </w:tblGrid>
+      <w:tr>
+        <w:tc>
+          <w:tcPr>
+            <w:tcW w:type="dxa" w:w="3213"/>
+            <w:tcBorders>
+              <w:top w:val="nil"/>
+              <w:left w:val="nil"/>
+              <w:bottom w:val="single" w:sz="4" w:color="C9D3DE" w:space="0"/>
+              <w:right w:val="nil"/>
+            </w:tcBorders>
+          </w:tcPr>
+          <w:p>
+            <w:pPr>
+              <w:spacing w:before="0" w:after="20"/>
+            </w:pPr>
+            <w:r>
+              <w:rPr>
+                <w:b/>
+                <w:caps/>
+                <w:color w:val="5F6B7A"/>
+                <w:sz w:val="15"/>
+              </w:rPr>
+              <w:t>Analysis date</w:t>
+            </w:r>
+          </w:p>
+          <w:p>
+            <w:pPr>
+              <w:spacing w:before="0" w:after="0"/>
+            </w:pPr>
+            <w:r>
+              <w:rPr>
+                <w:b w:val="0"/>
+                <w:sz w:val="19"/>
+              </w:rPr>
+              <w:t>2026-10-22</w:t>
+            </w:r>
+          </w:p>
+        </w:tc>
+        <w:tc>
+          <w:tcPr>
+            <w:tcW w:type="dxa" w:w="3213"/>
+            <w:tcBorders>
+              <w:top w:val="nil"/>
+              <w:left w:val="nil"/>
+              <w:bottom w:val="single" w:sz="4" w:color="C9D3DE" w:space="0"/>
+              <w:right w:val="nil"/>
+            </w:tcBorders>
+          </w:tcPr>
+          <w:p>
+            <w:pPr>
+              <w:spacing w:before="0" w:after="20"/>
+            </w:pPr>
+            <w:r>
+              <w:rPr>
+                <w:b/>
+                <w:caps/>
+                <w:color w:val="5F6B7A"/>
+                <w:sz w:val="15"/>
+              </w:rPr>
+              <w:t>Rating</w:t>
+            </w:r>
+          </w:p>
+          <w:p>
+            <w:pPr>
+              <w:spacing w:before="0" w:after="0"/>
+            </w:pPr>
+            <w:r>
+              <w:rPr>
+                <w:b w:val="0"/>
+                <w:sz w:val="19"/>
+              </w:rPr>
+              <w:t>nerasta (no public credit rating found)</w:t>
+            </w:r>
+          </w:p>
+        </w:tc>
+        <w:tc>
+          <w:tcPr>
+            <w:tcW w:type="dxa" w:w="3213"/>
+            <w:tcBorders>
+              <w:top w:val="nil"/>
+              <w:left w:val="nil"/>
+              <w:bottom w:val="single" w:sz="4" w:color="C9D3DE" w:space="0"/>
+              <w:right w:val="nil"/>
+            </w:tcBorders>
+          </w:tcPr>
+          <w:p>
+            <w:pPr>
+              <w:spacing w:before="0" w:after="20"/>
+            </w:pPr>
+            <w:r>
+              <w:rPr>
+                <w:b/>
+                <w:caps/>
+                <w:color w:val="5F6B7A"/>
+                <w:sz w:val="15"/>
+              </w:rPr>
+              <w:t>Next report</w:t>
+            </w:r>
+          </w:p>
+          <w:p>
+            <w:pPr>
+              <w:spacing w:before="0" w:after="0"/>
+            </w:pPr>
+            <w:r>
+              <w:rPr>
+                <w:b w:val="0"/>
+                <w:sz w:val="19"/>
+              </w:rPr>
+              <w:t>nerasta - Nortal reports are published only on its password-protected investor portal</w:t>
+            </w:r>
+            <w:hyperlink r:id="rId12">
+              <w:r>
+                <w:rPr>
+                  <w:color w:val="2A78D6"/>
+                  <w:vertAlign w:val="superscript"/>
+                  <w:sz w:val="16"/>
+                </w:rPr>
+                <w:t xml:space="preserve">1</w:t>
+              </w:r>
+            </w:hyperlink>
+          </w:p>
+        </w:tc>
+      </w:tr>
+    </w:tbl>
+    <w:p>
+      <w:pPr>
+        <w:spacing w:before="0" w:after="80"/>
+      </w:pPr>
+    </w:p>
+    <w:tbl>
+      <w:tblPr>
+        <w:tblW w:w="9639" w:type="dxa"/>
+        <w:tblBorders>
+          <w:top w:val="nil"/>
+          <w:left w:val="nil"/>
+          <w:bottom w:val="nil"/>
+          <w:right w:val="nil"/>
+          <w:insideH w:val="nil"/>
+          <w:insideV w:val="nil"/>
+        </w:tblBorders>
+        <w:tblLayout w:type="fixed"/>
+        <w:tblCellMar>
+          <w:top w:w="180" w:type="dxa"/>
+          <w:left w:w="260" w:type="dxa"/>
+          <w:bottom w:w="200" w:type="dxa"/>
+          <w:right w:w="260" w:type="dxa"/>
+        </w:tblCellMar>
+        <w:tblLook w:firstColumn="1" w:firstRow="1" w:lastColumn="0" w:lastRow="0" w:noHBand="0" w:noVBand="1" w:val="04A0"/>
+      </w:tblPr>
+      <w:tblGrid>
+        <w:gridCol w:w="9639"/>
       </w:tblGrid>
       <w:tr>
         <w:tc>
           <w:tcPr>
             <w:tcW w:type="dxa" w:w="9638"/>
+            <w:tcBorders>
+              <w:top w:val="nil"/>
+              <w:left w:val="single" w:sz="24" w:color="9A6400" w:space="0"/>
+              <w:bottom w:val="nil"/>
+              <w:right w:val="nil"/>
+            </w:tcBorders>
             <w:shd w:val="clear" w:color="auto" w:fill="FDF1D8"/>
           </w:tcPr>
           <w:p>
             <w:pPr>
-              <w:spacing w:before="60" w:after="60"/>
+              <w:spacing w:before="0" w:after="0" w:line="276" w:lineRule="auto"/>
             </w:pPr>
             <w:r>
               <w:rPr>
@@ -125,7 +300,7 @@
               </w:rPr>
               <w:t xml:space="preserve"> Nortal publishes its financial reports only on a password-protected investor portal, so the only public figures are 2025 revenue of EUR 254.2m (+15%) and EBITDA of EUR 23.8m</w:t>
             </w:r>
-            <w:hyperlink r:id="rId10">
+            <w:hyperlink r:id="rId12">
               <w:r>
                 <w:rPr>
                   <w:color w:val="2A78D6"/>
@@ -142,7 +317,7 @@
               </w:rPr>
               <w:t>,</w:t>
             </w:r>
-            <w:hyperlink r:id="rId11">
+            <w:hyperlink r:id="rId13">
               <w:r>
                 <w:rPr>
                   <w:color w:val="2A78D6"/>
@@ -166,99 +341,172 @@
     </w:tbl>
     <w:p>
       <w:pPr>
-        <w:spacing w:after="0"/>
+        <w:spacing w:before="0" w:after="120"/>
       </w:pPr>
     </w:p>
     <w:tbl>
       <w:tblPr>
-        <w:tblW w:type="auto" w:w="0"/>
-        <w:jc w:val="center"/>
+        <w:tblW w:w="9639" w:type="dxa"/>
+        <w:tblBorders>
+          <w:top w:val="nil"/>
+          <w:left w:val="nil"/>
+          <w:bottom w:val="nil"/>
+          <w:right w:val="nil"/>
+          <w:insideH w:val="nil"/>
+          <w:insideV w:val="nil"/>
+        </w:tblBorders>
+        <w:tblLayout w:type="fixed"/>
+        <w:tblCellMar>
+          <w:top w:w="150" w:type="dxa"/>
+          <w:left w:w="170" w:type="dxa"/>
+          <w:bottom w:w="150" w:type="dxa"/>
+          <w:right w:w="100" w:type="dxa"/>
+        </w:tblCellMar>
         <w:tblLook w:firstColumn="1" w:firstRow="1" w:lastColumn="0" w:lastRow="0" w:noHBand="0" w:noVBand="1" w:val="04A0"/>
-        <w:tblBorders>
-          <w:top w:val="single" w:sz="4" w:color="FFFFFF"/>
-          <w:left w:val="nil"/>
-          <w:bottom w:val="single" w:sz="4" w:color="FFFFFF"/>
-          <w:right w:val="nil"/>
-          <w:insideH w:val="single" w:sz="4" w:color="FFFFFF"/>
-          <w:insideV w:val="nil"/>
-        </w:tblBorders>
       </w:tblPr>
       <w:tblGrid>
-        <w:gridCol w:w="4986"/>
-        <w:gridCol w:w="4986"/>
+        <w:gridCol w:w="4720"/>
+        <w:gridCol w:w="198"/>
+        <w:gridCol w:w="4720"/>
       </w:tblGrid>
       <w:tr>
         <w:tc>
           <w:tcPr>
-            <w:tcW w:type="dxa" w:w="4986"/>
-            <w:shd w:val="clear" w:color="auto" w:fill="EAF1F8"/>
+            <w:tcW w:type="dxa" w:w="4720"/>
+            <w:tcBorders>
+              <w:top w:val="single" w:sz="18" w:color="2A78D6" w:space="0"/>
+              <w:left w:val="single" w:sz="4" w:color="C9D3DE" w:space="0"/>
+              <w:bottom w:val="single" w:sz="4" w:color="C9D3DE" w:space="0"/>
+              <w:right w:val="single" w:sz="4" w:color="C9D3DE" w:space="0"/>
+            </w:tcBorders>
           </w:tcPr>
           <w:p>
-            <w:r/>
+            <w:pPr>
+              <w:spacing w:before="0" w:after="60"/>
+            </w:pPr>
             <w:r>
               <w:rPr>
+                <w:b/>
+                <w:caps/>
                 <w:color w:val="5F6B7A"/>
-                <w:sz w:val="16"/>
+                <w:sz w:val="14"/>
               </w:rPr>
-              <w:t>Revenue (FY2025)</w:t>
+              <w:t>Revenue</w:t>
+            </w:r>
+            <w:r>
+              <w:rPr>
+                <w:b w:val="0"/>
+                <w:color w:val="5F6B7A"/>
+                <w:sz w:val="14"/>
+              </w:rPr>
+              <w:t xml:space="preserve">  ·  FY2025</w:t>
             </w:r>
           </w:p>
           <w:p>
             <w:pPr>
-              <w:spacing w:after="0"/>
+              <w:spacing w:before="0" w:after="20"/>
             </w:pPr>
             <w:r>
               <w:rPr>
                 <w:b/>
                 <w:color w:val="1F4E79"/>
-                <w:sz w:val="26"/>
+                <w:sz w:val="34"/>
               </w:rPr>
-              <w:t>254.2 EUR m</w:t>
+              <w:t>254.2</w:t>
+            </w:r>
+            <w:r>
+              <w:rPr>
+                <w:b w:val="0"/>
+                <w:color w:val="5F6B7A"/>
+                <w:sz w:val="18"/>
+              </w:rPr>
+              <w:t xml:space="preserve"> EUR m</w:t>
             </w:r>
           </w:p>
           <w:p>
+            <w:pPr>
+              <w:spacing w:before="0" w:after="0"/>
+            </w:pPr>
             <w:r>
               <w:rPr>
+                <w:b w:val="0"/>
                 <w:color w:val="5F6B7A"/>
-                <w:sz w:val="16"/>
+                <w:sz w:val="15"/>
               </w:rPr>
+              <w:t xml:space="preserve"> </w:t>
             </w:r>
           </w:p>
         </w:tc>
         <w:tc>
           <w:tcPr>
-            <w:tcW w:type="dxa" w:w="4986"/>
-            <w:shd w:val="clear" w:color="auto" w:fill="EAF1F8"/>
+            <w:tcW w:type="dxa" w:w="198"/>
+          </w:tcPr>
+          <w:p/>
+        </w:tc>
+        <w:tc>
+          <w:tcPr>
+            <w:tcW w:type="dxa" w:w="4720"/>
+            <w:tcBorders>
+              <w:top w:val="single" w:sz="18" w:color="2A78D6" w:space="0"/>
+              <w:left w:val="single" w:sz="4" w:color="C9D3DE" w:space="0"/>
+              <w:bottom w:val="single" w:sz="4" w:color="C9D3DE" w:space="0"/>
+              <w:right w:val="single" w:sz="4" w:color="C9D3DE" w:space="0"/>
+            </w:tcBorders>
           </w:tcPr>
           <w:p>
-            <w:r/>
+            <w:pPr>
+              <w:spacing w:before="0" w:after="60"/>
+            </w:pPr>
             <w:r>
               <w:rPr>
+                <w:b/>
+                <w:caps/>
                 <w:color w:val="5F6B7A"/>
-                <w:sz w:val="16"/>
+                <w:sz w:val="14"/>
               </w:rPr>
-              <w:t>EBITDA (FY2025)</w:t>
+              <w:t>EBITDA</w:t>
+            </w:r>
+            <w:r>
+              <w:rPr>
+                <w:b w:val="0"/>
+                <w:color w:val="5F6B7A"/>
+                <w:sz w:val="14"/>
+              </w:rPr>
+              <w:t xml:space="preserve">  ·  FY2025</w:t>
             </w:r>
           </w:p>
           <w:p>
             <w:pPr>
-              <w:spacing w:after="0"/>
+              <w:spacing w:before="0" w:after="20"/>
             </w:pPr>
             <w:r>
               <w:rPr>
                 <w:b/>
                 <w:color w:val="1F4E79"/>
-                <w:sz w:val="26"/>
+                <w:sz w:val="34"/>
               </w:rPr>
-              <w:t>23.8 EUR m</w:t>
+              <w:t>23.8</w:t>
+            </w:r>
+            <w:r>
+              <w:rPr>
+                <w:b w:val="0"/>
+                <w:color w:val="5F6B7A"/>
+                <w:sz w:val="18"/>
+              </w:rPr>
+              <w:t xml:space="preserve"> EUR m</w:t>
             </w:r>
           </w:p>
           <w:p>
+            <w:pPr>
+              <w:spacing w:before="0" w:after="0"/>
+            </w:pPr>
             <w:r>
               <w:rPr>
+                <w:b w:val="0"/>
                 <w:color w:val="5F6B7A"/>
-                <w:sz w:val="16"/>
+                <w:sz w:val="15"/>
               </w:rPr>
+              <w:t xml:space="preserve"> </w:t>
             </w:r>
           </w:p>
         </w:tc>
@@ -266,11 +514,29 @@
     </w:tbl>
     <w:p>
       <w:pPr>
-        <w:spacing w:before="280" w:after="80"/>
+        <w:spacing w:before="0" w:after="40"/>
+      </w:pPr>
+    </w:p>
+    <w:p>
+      <w:pPr>
+        <w:keepNext/>
         <w:pBdr>
-          <w:bottom w:val="single" w:sz="6" w:color="C9D3DE" w:space="2"/>
+          <w:bottom w:val="single" w:sz="8" w:color="1F4E79" w:space="4"/>
         </w:pBdr>
+        <w:tabs>
+          <w:tab w:pos="482" w:val="left"/>
+        </w:tabs>
+        <w:spacing w:before="360" w:after="160"/>
       </w:pPr>
+      <w:r>
+        <w:rPr>
+          <w:b/>
+          <w:color w:val="2A78D6"/>
+          <w:sz w:val="18"/>
+        </w:rPr>
+        <w:t>01</w:t>
+        <w:tab/>
+      </w:r>
       <w:r>
         <w:rPr>
           <w:b/>
@@ -282,9 +548,21 @@
     </w:p>
     <w:p>
       <w:pPr>
-        <w:pStyle w:val="ListBullet"/>
-        <w:spacing w:after="60"/>
+        <w:tabs>
+          <w:tab w:pos="255" w:val="left"/>
+        </w:tabs>
+        <w:spacing w:before="0" w:after="80"/>
+        <w:ind w:left="255" w:hanging="255"/>
       </w:pPr>
+      <w:r>
+        <w:rPr>
+          <w:b/>
+          <w:color w:val="2A78D6"/>
+          <w:sz w:val="20"/>
+        </w:rPr>
+        <w:t>▪</w:t>
+        <w:tab/>
+      </w:r>
       <w:r>
         <w:rPr>
           <w:b/>
@@ -297,7 +575,7 @@
         </w:rPr>
         <w:t xml:space="preserve"> 2025 revenue EUR 254.2m (+15%), EBITDA EUR 23.8m; the company says it invested heavily and went through significant changes</w:t>
       </w:r>
-      <w:hyperlink r:id="rId11">
+      <w:hyperlink r:id="rId13">
         <w:r>
           <w:rPr>
             <w:color w:val="2A78D6"/>
@@ -316,9 +594,21 @@
     </w:p>
     <w:p>
       <w:pPr>
-        <w:pStyle w:val="ListBullet"/>
-        <w:spacing w:after="60"/>
+        <w:tabs>
+          <w:tab w:pos="255" w:val="left"/>
+        </w:tabs>
+        <w:spacing w:before="0" w:after="80"/>
+        <w:ind w:left="255" w:hanging="255"/>
       </w:pPr>
+      <w:r>
+        <w:rPr>
+          <w:b/>
+          <w:color w:val="2A78D6"/>
+          <w:sz w:val="20"/>
+        </w:rPr>
+        <w:t>▪</w:t>
+        <w:tab/>
+      </w:r>
       <w:r>
         <w:rPr>
           <w:b/>
@@ -331,7 +621,7 @@
         </w:rPr>
         <w:t xml:space="preserve"> Nearsure (US, July 2025), Accela's Middle East division (October 2025), iSAX IoT consulting (Germany, July 2026)</w:t>
       </w:r>
-      <w:hyperlink r:id="rId11">
+      <w:hyperlink r:id="rId13">
         <w:r>
           <w:rPr>
             <w:color w:val="2A78D6"/>
@@ -348,7 +638,7 @@
         </w:rPr>
         <w:t>,</w:t>
       </w:r>
-      <w:hyperlink r:id="rId12">
+      <w:hyperlink r:id="rId14">
         <w:r>
           <w:rPr>
             <w:color w:val="2A78D6"/>
@@ -367,9 +657,21 @@
     </w:p>
     <w:p>
       <w:pPr>
-        <w:pStyle w:val="ListBullet"/>
-        <w:spacing w:after="60"/>
+        <w:tabs>
+          <w:tab w:pos="255" w:val="left"/>
+        </w:tabs>
+        <w:spacing w:before="0" w:after="80"/>
+        <w:ind w:left="255" w:hanging="255"/>
       </w:pPr>
+      <w:r>
+        <w:rPr>
+          <w:b/>
+          <w:color w:val="2A78D6"/>
+          <w:sz w:val="20"/>
+        </w:rPr>
+        <w:t>▪</w:t>
+        <w:tab/>
+      </w:r>
       <w:r>
         <w:rPr>
           <w:b/>
@@ -382,7 +684,7 @@
         </w:rPr>
         <w:t xml:space="preserve"> interim reports, debt and covenant figures are not public</w:t>
       </w:r>
-      <w:hyperlink r:id="rId10">
+      <w:hyperlink r:id="rId12">
         <w:r>
           <w:rPr>
             <w:color w:val="2A78D6"/>
@@ -401,11 +703,24 @@
     </w:p>
     <w:p>
       <w:pPr>
-        <w:spacing w:before="280" w:after="80"/>
+        <w:keepNext/>
         <w:pBdr>
-          <w:bottom w:val="single" w:sz="6" w:color="C9D3DE" w:space="2"/>
+          <w:bottom w:val="single" w:sz="8" w:color="1F4E79" w:space="4"/>
         </w:pBdr>
+        <w:tabs>
+          <w:tab w:pos="482" w:val="left"/>
+        </w:tabs>
+        <w:spacing w:before="360" w:after="160"/>
       </w:pPr>
+      <w:r>
+        <w:rPr>
+          <w:b/>
+          <w:color w:val="2A78D6"/>
+          <w:sz w:val="18"/>
+        </w:rPr>
+        <w:t>02</w:t>
+        <w:tab/>
+      </w:r>
       <w:r>
         <w:rPr>
           <w:b/>
@@ -417,37 +732,53 @@
     </w:p>
     <w:tbl>
       <w:tblPr>
-        <w:tblW w:type="auto" w:w="0"/>
+        <w:tblW w:w="9639" w:type="dxa"/>
+        <w:tblBorders>
+          <w:top w:val="nil"/>
+          <w:left w:val="nil"/>
+          <w:bottom w:val="nil"/>
+          <w:right w:val="nil"/>
+          <w:insideH w:val="nil"/>
+          <w:insideV w:val="nil"/>
+        </w:tblBorders>
+        <w:tblLayout w:type="fixed"/>
+        <w:tblCellMar>
+          <w:top w:w="70" w:type="dxa"/>
+          <w:left w:w="100" w:type="dxa"/>
+          <w:bottom w:w="70" w:type="dxa"/>
+          <w:right w:w="100" w:type="dxa"/>
+        </w:tblCellMar>
         <w:tblLook w:firstColumn="1" w:firstRow="1" w:lastColumn="0" w:lastRow="0" w:noHBand="0" w:noVBand="1" w:val="04A0"/>
-        <w:tblBorders>
-          <w:top w:val="single" w:sz="4" w:color="C9D3DE"/>
-          <w:left w:val="nil"/>
-          <w:bottom w:val="single" w:sz="4" w:color="C9D3DE"/>
-          <w:right w:val="nil"/>
-          <w:insideH w:val="single" w:sz="4" w:color="C9D3DE"/>
-          <w:insideV w:val="nil"/>
-        </w:tblBorders>
       </w:tblPr>
       <w:tblGrid>
-        <w:gridCol w:w="1994"/>
-        <w:gridCol w:w="1994"/>
-        <w:gridCol w:w="1994"/>
-        <w:gridCol w:w="1994"/>
-        <w:gridCol w:w="1994"/>
+        <w:gridCol w:w="1701"/>
+        <w:gridCol w:w="2608"/>
+        <w:gridCol w:w="963"/>
+        <w:gridCol w:w="1304"/>
+        <w:gridCol w:w="3061"/>
       </w:tblGrid>
       <w:tr>
         <w:tc>
           <w:tcPr>
             <w:tcW w:type="dxa" w:w="1701"/>
-            <w:shd w:val="clear" w:color="auto" w:fill="1F4E79"/>
+            <w:tcBorders>
+              <w:top w:val="single" w:sz="12" w:color="1F4E79" w:space="0"/>
+              <w:left w:val="nil"/>
+              <w:bottom w:val="single" w:sz="4" w:color="C9D3DE" w:space="0"/>
+              <w:right w:val="nil"/>
+            </w:tcBorders>
+            <w:shd w:val="clear" w:color="auto" w:fill="EAF1F8"/>
           </w:tcPr>
           <w:p>
-            <w:r/>
+            <w:pPr>
+              <w:spacing w:before="0" w:after="0"/>
+            </w:pPr>
             <w:r>
               <w:rPr>
                 <w:b/>
-                <w:color w:val="FFFFFF"/>
-                <w:sz w:val="17"/>
+                <w:caps/>
+                <w:color w:val="1F4E79"/>
+                <w:sz w:val="16"/>
               </w:rPr>
               <w:t>ISIN</w:t>
             </w:r>
@@ -456,15 +787,24 @@
         <w:tc>
           <w:tcPr>
             <w:tcW w:type="dxa" w:w="2608"/>
-            <w:shd w:val="clear" w:color="auto" w:fill="1F4E79"/>
+            <w:tcBorders>
+              <w:top w:val="single" w:sz="12" w:color="1F4E79" w:space="0"/>
+              <w:left w:val="nil"/>
+              <w:bottom w:val="single" w:sz="4" w:color="C9D3DE" w:space="0"/>
+              <w:right w:val="nil"/>
+            </w:tcBorders>
+            <w:shd w:val="clear" w:color="auto" w:fill="EAF1F8"/>
           </w:tcPr>
           <w:p>
-            <w:r/>
+            <w:pPr>
+              <w:spacing w:before="0" w:after="0"/>
+            </w:pPr>
             <w:r>
               <w:rPr>
                 <w:b/>
-                <w:color w:val="FFFFFF"/>
-                <w:sz w:val="17"/>
+                <w:caps/>
+                <w:color w:val="1F4E79"/>
+                <w:sz w:val="16"/>
               </w:rPr>
               <w:t>Instrument</w:t>
             </w:r>
@@ -473,18 +813,25 @@
         <w:tc>
           <w:tcPr>
             <w:tcW w:type="dxa" w:w="964"/>
-            <w:shd w:val="clear" w:color="auto" w:fill="1F4E79"/>
+            <w:tcBorders>
+              <w:top w:val="single" w:sz="12" w:color="1F4E79" w:space="0"/>
+              <w:left w:val="nil"/>
+              <w:bottom w:val="single" w:sz="4" w:color="C9D3DE" w:space="0"/>
+              <w:right w:val="nil"/>
+            </w:tcBorders>
+            <w:shd w:val="clear" w:color="auto" w:fill="EAF1F8"/>
           </w:tcPr>
           <w:p>
             <w:pPr>
+              <w:spacing w:before="0" w:after="0"/>
               <w:jc w:val="right"/>
             </w:pPr>
-            <w:r/>
             <w:r>
               <w:rPr>
                 <w:b/>
-                <w:color w:val="FFFFFF"/>
-                <w:sz w:val="17"/>
+                <w:caps/>
+                <w:color w:val="1F4E79"/>
+                <w:sz w:val="16"/>
               </w:rPr>
               <w:t>Coupon</w:t>
             </w:r>
@@ -493,15 +840,24 @@
         <w:tc>
           <w:tcPr>
             <w:tcW w:type="dxa" w:w="1304"/>
-            <w:shd w:val="clear" w:color="auto" w:fill="1F4E79"/>
+            <w:tcBorders>
+              <w:top w:val="single" w:sz="12" w:color="1F4E79" w:space="0"/>
+              <w:left w:val="nil"/>
+              <w:bottom w:val="single" w:sz="4" w:color="C9D3DE" w:space="0"/>
+              <w:right w:val="nil"/>
+            </w:tcBorders>
+            <w:shd w:val="clear" w:color="auto" w:fill="EAF1F8"/>
           </w:tcPr>
           <w:p>
-            <w:r/>
+            <w:pPr>
+              <w:spacing w:before="0" w:after="0"/>
+            </w:pPr>
             <w:r>
               <w:rPr>
                 <w:b/>
-                <w:color w:val="FFFFFF"/>
-                <w:sz w:val="17"/>
+                <w:caps/>
+                <w:color w:val="1F4E79"/>
+                <w:sz w:val="16"/>
               </w:rPr>
               <w:t>Maturity</w:t>
             </w:r>
@@ -510,15 +866,24 @@
         <w:tc>
           <w:tcPr>
             <w:tcW w:type="dxa" w:w="3061"/>
-            <w:shd w:val="clear" w:color="auto" w:fill="1F4E79"/>
+            <w:tcBorders>
+              <w:top w:val="single" w:sz="12" w:color="1F4E79" w:space="0"/>
+              <w:left w:val="nil"/>
+              <w:bottom w:val="single" w:sz="4" w:color="C9D3DE" w:space="0"/>
+              <w:right w:val="nil"/>
+            </w:tcBorders>
+            <w:shd w:val="clear" w:color="auto" w:fill="EAF1F8"/>
           </w:tcPr>
           <w:p>
-            <w:r/>
+            <w:pPr>
+              <w:spacing w:before="0" w:after="0"/>
+            </w:pPr>
             <w:r>
               <w:rPr>
                 <w:b/>
-                <w:color w:val="FFFFFF"/>
-                <w:sz w:val="17"/>
+                <w:caps/>
+                <w:color w:val="1F4E79"/>
+                <w:sz w:val="16"/>
               </w:rPr>
               <w:t>Note</w:t>
             </w:r>
@@ -529,12 +894,17 @@
         <w:tc>
           <w:tcPr>
             <w:tcW w:type="dxa" w:w="1701"/>
+            <w:tcBorders>
+              <w:top w:val="nil"/>
+              <w:left w:val="nil"/>
+              <w:bottom w:val="single" w:sz="4" w:color="DDE3EA" w:space="0"/>
+              <w:right w:val="nil"/>
+            </w:tcBorders>
           </w:tcPr>
           <w:p>
             <w:pPr>
-              <w:spacing w:after="0"/>
+              <w:spacing w:before="0" w:after="0"/>
             </w:pPr>
-            <w:r/>
             <w:r>
               <w:rPr>
                 <w:b w:val="0"/>
@@ -547,12 +917,17 @@
         <w:tc>
           <w:tcPr>
             <w:tcW w:type="dxa" w:w="2608"/>
+            <w:tcBorders>
+              <w:top w:val="nil"/>
+              <w:left w:val="nil"/>
+              <w:bottom w:val="single" w:sz="4" w:color="DDE3EA" w:space="0"/>
+              <w:right w:val="nil"/>
+            </w:tcBorders>
           </w:tcPr>
           <w:p>
             <w:pPr>
-              <w:spacing w:after="0"/>
+              <w:spacing w:before="0" w:after="0"/>
             </w:pPr>
-            <w:r/>
             <w:r>
               <w:rPr>
                 <w:b w:val="0"/>
@@ -565,13 +940,18 @@
         <w:tc>
           <w:tcPr>
             <w:tcW w:type="dxa" w:w="964"/>
+            <w:tcBorders>
+              <w:top w:val="nil"/>
+              <w:left w:val="nil"/>
+              <w:bottom w:val="single" w:sz="4" w:color="DDE3EA" w:space="0"/>
+              <w:right w:val="nil"/>
+            </w:tcBorders>
           </w:tcPr>
           <w:p>
             <w:pPr>
-              <w:spacing w:after="0"/>
+              <w:spacing w:before="0" w:after="0"/>
               <w:jc w:val="right"/>
             </w:pPr>
-            <w:r/>
             <w:r>
               <w:rPr>
                 <w:b w:val="0"/>
@@ -584,12 +964,17 @@
         <w:tc>
           <w:tcPr>
             <w:tcW w:type="dxa" w:w="1304"/>
+            <w:tcBorders>
+              <w:top w:val="nil"/>
+              <w:left w:val="nil"/>
+              <w:bottom w:val="single" w:sz="4" w:color="DDE3EA" w:space="0"/>
+              <w:right w:val="nil"/>
+            </w:tcBorders>
           </w:tcPr>
           <w:p>
             <w:pPr>
-              <w:spacing w:after="0"/>
+              <w:spacing w:before="0" w:after="0"/>
             </w:pPr>
-            <w:r/>
             <w:r>
               <w:rPr>
                 <w:b w:val="0"/>
@@ -602,12 +987,17 @@
         <w:tc>
           <w:tcPr>
             <w:tcW w:type="dxa" w:w="3061"/>
+            <w:tcBorders>
+              <w:top w:val="nil"/>
+              <w:left w:val="nil"/>
+              <w:bottom w:val="single" w:sz="4" w:color="DDE3EA" w:space="0"/>
+              <w:right w:val="nil"/>
+            </w:tcBorders>
           </w:tcPr>
           <w:p>
             <w:pPr>
-              <w:spacing w:after="0"/>
+              <w:spacing w:before="0" w:after="0"/>
             </w:pPr>
-            <w:r/>
             <w:r>
               <w:rPr>
                 <w:b w:val="0"/>
@@ -621,11 +1011,29 @@
     </w:tbl>
     <w:p>
       <w:pPr>
-        <w:spacing w:before="280" w:after="80"/>
+        <w:spacing w:before="0" w:after="40"/>
+      </w:pPr>
+    </w:p>
+    <w:p>
+      <w:pPr>
+        <w:keepNext/>
         <w:pBdr>
-          <w:bottom w:val="single" w:sz="6" w:color="C9D3DE" w:space="2"/>
+          <w:bottom w:val="single" w:sz="8" w:color="1F4E79" w:space="4"/>
         </w:pBdr>
+        <w:tabs>
+          <w:tab w:pos="482" w:val="left"/>
+        </w:tabs>
+        <w:spacing w:before="360" w:after="160"/>
       </w:pPr>
+      <w:r>
+        <w:rPr>
+          <w:b/>
+          <w:color w:val="2A78D6"/>
+          <w:sz w:val="18"/>
+        </w:rPr>
+        <w:t>03</w:t>
+        <w:tab/>
+      </w:r>
       <w:r>
         <w:rPr>
           <w:b/>
@@ -637,35 +1045,51 @@
     </w:p>
     <w:tbl>
       <w:tblPr>
-        <w:tblW w:type="auto" w:w="0"/>
+        <w:tblW w:w="9639" w:type="dxa"/>
+        <w:tblBorders>
+          <w:top w:val="nil"/>
+          <w:left w:val="nil"/>
+          <w:bottom w:val="nil"/>
+          <w:right w:val="nil"/>
+          <w:insideH w:val="nil"/>
+          <w:insideV w:val="nil"/>
+        </w:tblBorders>
+        <w:tblLayout w:type="fixed"/>
+        <w:tblCellMar>
+          <w:top w:w="70" w:type="dxa"/>
+          <w:left w:w="100" w:type="dxa"/>
+          <w:bottom w:w="70" w:type="dxa"/>
+          <w:right w:w="100" w:type="dxa"/>
+        </w:tblCellMar>
         <w:tblLook w:firstColumn="1" w:firstRow="1" w:lastColumn="0" w:lastRow="0" w:noHBand="0" w:noVBand="1" w:val="04A0"/>
-        <w:tblBorders>
-          <w:top w:val="single" w:sz="4" w:color="C9D3DE"/>
-          <w:left w:val="nil"/>
-          <w:bottom w:val="single" w:sz="4" w:color="C9D3DE"/>
-          <w:right w:val="nil"/>
-          <w:insideH w:val="single" w:sz="4" w:color="C9D3DE"/>
-          <w:insideV w:val="nil"/>
-        </w:tblBorders>
       </w:tblPr>
       <w:tblGrid>
-        <w:gridCol w:w="3324"/>
-        <w:gridCol w:w="3324"/>
-        <w:gridCol w:w="3324"/>
+        <w:gridCol w:w="4475"/>
+        <w:gridCol w:w="1807"/>
+        <w:gridCol w:w="3356"/>
       </w:tblGrid>
       <w:tr>
         <w:tc>
           <w:tcPr>
-            <w:tcW w:type="dxa" w:w="2948"/>
-            <w:shd w:val="clear" w:color="auto" w:fill="1F4E79"/>
+            <w:tcW w:type="dxa" w:w="4475"/>
+            <w:tcBorders>
+              <w:top w:val="single" w:sz="12" w:color="1F4E79" w:space="0"/>
+              <w:left w:val="nil"/>
+              <w:bottom w:val="single" w:sz="4" w:color="C9D3DE" w:space="0"/>
+              <w:right w:val="nil"/>
+            </w:tcBorders>
+            <w:shd w:val="clear" w:color="auto" w:fill="EAF1F8"/>
           </w:tcPr>
           <w:p>
-            <w:r/>
+            <w:pPr>
+              <w:spacing w:before="0" w:after="0"/>
+            </w:pPr>
             <w:r>
               <w:rPr>
                 <w:b/>
-                <w:color w:val="FFFFFF"/>
-                <w:sz w:val="17"/>
+                <w:caps/>
+                <w:color w:val="1F4E79"/>
+                <w:sz w:val="16"/>
               </w:rPr>
               <w:t>Metric</w:t>
             </w:r>
@@ -673,19 +1097,26 @@
         </w:tc>
         <w:tc>
           <w:tcPr>
-            <w:tcW w:type="dxa" w:w="1191"/>
-            <w:shd w:val="clear" w:color="auto" w:fill="1F4E79"/>
+            <w:tcW w:type="dxa" w:w="1807"/>
+            <w:tcBorders>
+              <w:top w:val="single" w:sz="12" w:color="1F4E79" w:space="0"/>
+              <w:left w:val="nil"/>
+              <w:bottom w:val="single" w:sz="4" w:color="C9D3DE" w:space="0"/>
+              <w:right w:val="nil"/>
+            </w:tcBorders>
+            <w:shd w:val="clear" w:color="auto" w:fill="EAF1F8"/>
           </w:tcPr>
           <w:p>
             <w:pPr>
+              <w:spacing w:before="0" w:after="0"/>
               <w:jc w:val="right"/>
             </w:pPr>
-            <w:r/>
             <w:r>
               <w:rPr>
                 <w:b/>
-                <w:color w:val="FFFFFF"/>
-                <w:sz w:val="17"/>
+                <w:caps/>
+                <w:color w:val="1F4E79"/>
+                <w:sz w:val="16"/>
               </w:rPr>
               <w:t>FY2025</w:t>
             </w:r>
@@ -693,19 +1124,26 @@
         </w:tc>
         <w:tc>
           <w:tcPr>
-            <w:tcW w:type="dxa" w:w="2211"/>
-            <w:shd w:val="clear" w:color="auto" w:fill="1F4E79"/>
+            <w:tcW w:type="dxa" w:w="3356"/>
+            <w:tcBorders>
+              <w:top w:val="single" w:sz="12" w:color="1F4E79" w:space="0"/>
+              <w:left w:val="nil"/>
+              <w:bottom w:val="single" w:sz="4" w:color="C9D3DE" w:space="0"/>
+              <w:right w:val="nil"/>
+            </w:tcBorders>
+            <w:shd w:val="clear" w:color="auto" w:fill="EAF1F8"/>
           </w:tcPr>
           <w:p>
             <w:pPr>
+              <w:spacing w:before="0" w:after="0"/>
               <w:jc w:val="right"/>
             </w:pPr>
-            <w:r/>
             <w:r>
               <w:rPr>
                 <w:b/>
-                <w:color w:val="FFFFFF"/>
-                <w:sz w:val="17"/>
+                <w:caps/>
+                <w:color w:val="1F4E79"/>
+                <w:sz w:val="16"/>
               </w:rPr>
               <w:t>Change</w:t>
             </w:r>
@@ -715,13 +1153,18 @@
       <w:tr>
         <w:tc>
           <w:tcPr>
-            <w:tcW w:type="dxa" w:w="2948"/>
+            <w:tcW w:type="dxa" w:w="4475"/>
+            <w:tcBorders>
+              <w:top w:val="nil"/>
+              <w:left w:val="nil"/>
+              <w:bottom w:val="single" w:sz="4" w:color="DDE3EA" w:space="0"/>
+              <w:right w:val="nil"/>
+            </w:tcBorders>
           </w:tcPr>
           <w:p>
             <w:pPr>
-              <w:spacing w:after="0"/>
+              <w:spacing w:before="0" w:after="0"/>
             </w:pPr>
-            <w:r/>
             <w:r>
               <w:rPr>
                 <w:b w:val="0"/>
@@ -729,7 +1172,7 @@
               </w:rPr>
               <w:t>Revenue, EUR m</w:t>
             </w:r>
-            <w:hyperlink r:id="rId11">
+            <w:hyperlink r:id="rId13">
               <w:r>
                 <w:rPr>
                   <w:color w:val="2A78D6"/>
@@ -743,14 +1186,19 @@
         </w:tc>
         <w:tc>
           <w:tcPr>
-            <w:tcW w:type="dxa" w:w="1191"/>
+            <w:tcW w:type="dxa" w:w="1807"/>
+            <w:tcBorders>
+              <w:top w:val="nil"/>
+              <w:left w:val="nil"/>
+              <w:bottom w:val="single" w:sz="4" w:color="DDE3EA" w:space="0"/>
+              <w:right w:val="nil"/>
+            </w:tcBorders>
           </w:tcPr>
           <w:p>
             <w:pPr>
-              <w:spacing w:after="0"/>
+              <w:spacing w:before="0" w:after="0"/>
               <w:jc w:val="right"/>
             </w:pPr>
-            <w:r/>
             <w:r>
               <w:rPr>
                 <w:b w:val="0"/>
@@ -762,14 +1210,19 @@
         </w:tc>
         <w:tc>
           <w:tcPr>
-            <w:tcW w:type="dxa" w:w="2211"/>
+            <w:tcW w:type="dxa" w:w="3356"/>
+            <w:tcBorders>
+              <w:top w:val="nil"/>
+              <w:left w:val="nil"/>
+              <w:bottom w:val="single" w:sz="4" w:color="DDE3EA" w:space="0"/>
+              <w:right w:val="nil"/>
+            </w:tcBorders>
           </w:tcPr>
           <w:p>
             <w:pPr>
-              <w:spacing w:after="0"/>
+              <w:spacing w:before="0" w:after="0"/>
               <w:jc w:val="right"/>
             </w:pPr>
-            <w:r/>
             <w:r>
               <w:rPr>
                 <w:b w:val="0"/>
@@ -784,14 +1237,18 @@
       <w:tr>
         <w:tc>
           <w:tcPr>
-            <w:tcW w:type="dxa" w:w="2948"/>
-            <w:shd w:val="clear" w:color="auto" w:fill="F6F8FA"/>
+            <w:tcW w:type="dxa" w:w="4475"/>
+            <w:tcBorders>
+              <w:top w:val="nil"/>
+              <w:left w:val="nil"/>
+              <w:bottom w:val="single" w:sz="4" w:color="DDE3EA" w:space="0"/>
+              <w:right w:val="nil"/>
+            </w:tcBorders>
           </w:tcPr>
           <w:p>
             <w:pPr>
-              <w:spacing w:after="0"/>
+              <w:spacing w:before="0" w:after="0"/>
             </w:pPr>
-            <w:r/>
             <w:r>
               <w:rPr>
                 <w:b w:val="0"/>
@@ -799,7 +1256,7 @@
               </w:rPr>
               <w:t>EBITDA, EUR m</w:t>
             </w:r>
-            <w:hyperlink r:id="rId11">
+            <w:hyperlink r:id="rId13">
               <w:r>
                 <w:rPr>
                   <w:color w:val="2A78D6"/>
@@ -813,15 +1270,19 @@
         </w:tc>
         <w:tc>
           <w:tcPr>
-            <w:tcW w:type="dxa" w:w="1191"/>
-            <w:shd w:val="clear" w:color="auto" w:fill="F6F8FA"/>
+            <w:tcW w:type="dxa" w:w="1807"/>
+            <w:tcBorders>
+              <w:top w:val="nil"/>
+              <w:left w:val="nil"/>
+              <w:bottom w:val="single" w:sz="4" w:color="DDE3EA" w:space="0"/>
+              <w:right w:val="nil"/>
+            </w:tcBorders>
           </w:tcPr>
           <w:p>
             <w:pPr>
-              <w:spacing w:after="0"/>
+              <w:spacing w:before="0" w:after="0"/>
               <w:jc w:val="right"/>
             </w:pPr>
-            <w:r/>
             <w:r>
               <w:rPr>
                 <w:b w:val="0"/>
@@ -833,15 +1294,19 @@
         </w:tc>
         <w:tc>
           <w:tcPr>
-            <w:tcW w:type="dxa" w:w="2211"/>
-            <w:shd w:val="clear" w:color="auto" w:fill="F6F8FA"/>
+            <w:tcW w:type="dxa" w:w="3356"/>
+            <w:tcBorders>
+              <w:top w:val="nil"/>
+              <w:left w:val="nil"/>
+              <w:bottom w:val="single" w:sz="4" w:color="DDE3EA" w:space="0"/>
+              <w:right w:val="nil"/>
+            </w:tcBorders>
           </w:tcPr>
           <w:p>
             <w:pPr>
-              <w:spacing w:after="0"/>
+              <w:spacing w:before="0" w:after="0"/>
               <w:jc w:val="right"/>
             </w:pPr>
-            <w:r/>
             <w:r>
               <w:rPr>
                 <w:b w:val="0"/>
@@ -855,9 +1320,17 @@
       </w:tr>
     </w:tbl>
     <w:p>
+      <w:pPr>
+        <w:spacing w:before="0" w:after="40"/>
+      </w:pPr>
+    </w:p>
+    <w:p>
+      <w:pPr>
+        <w:spacing w:before="40" w:after="60"/>
+      </w:pPr>
       <w:r>
         <w:rPr>
-          <w:i/>
+          <w:b w:val="0"/>
           <w:color w:val="5F6B7A"/>
           <w:sz w:val="16"/>
         </w:rPr>
@@ -865,9 +1338,12 @@
       </w:r>
     </w:p>
     <w:p>
+      <w:pPr>
+        <w:spacing w:before="40" w:after="60"/>
+      </w:pPr>
       <w:r>
         <w:rPr>
-          <w:i/>
+          <w:b w:val="0"/>
           <w:color w:val="5F6B7A"/>
           <w:sz w:val="16"/>
         </w:rPr>
@@ -891,7 +1367,7 @@
                     <pic:cNvPicPr/>
                   </pic:nvPicPr>
                   <pic:blipFill>
-                    <a:blip r:embed="rId13"/>
+                    <a:blip r:embed="rId15"/>
                     <a:stretch>
                       <a:fillRect/>
                     </a:stretch>
@@ -912,11 +1388,24 @@
     </w:p>
     <w:p>
       <w:pPr>
-        <w:spacing w:before="280" w:after="80"/>
+        <w:keepNext/>
         <w:pBdr>
-          <w:bottom w:val="single" w:sz="6" w:color="C9D3DE" w:space="2"/>
+          <w:bottom w:val="single" w:sz="8" w:color="1F4E79" w:space="4"/>
         </w:pBdr>
+        <w:tabs>
+          <w:tab w:pos="482" w:val="left"/>
+        </w:tabs>
+        <w:spacing w:before="360" w:after="160"/>
       </w:pPr>
+      <w:r>
+        <w:rPr>
+          <w:b/>
+          <w:color w:val="2A78D6"/>
+          <w:sz w:val="18"/>
+        </w:rPr>
+        <w:t>04</w:t>
+        <w:tab/>
+      </w:r>
       <w:r>
         <w:rPr>
           <w:b/>
@@ -928,16 +1417,28 @@
     </w:p>
     <w:p>
       <w:pPr>
-        <w:pStyle w:val="ListBullet"/>
-        <w:spacing w:after="60"/>
+        <w:tabs>
+          <w:tab w:pos="255" w:val="left"/>
+        </w:tabs>
+        <w:spacing w:before="0" w:after="80"/>
+        <w:ind w:left="255" w:hanging="255"/>
       </w:pPr>
+      <w:r>
+        <w:rPr>
+          <w:b/>
+          <w:color w:val="2A78D6"/>
+          <w:sz w:val="20"/>
+        </w:rPr>
+        <w:t>▪</w:t>
+        <w:tab/>
+      </w:r>
       <w:r>
         <w:rPr>
           <w:b w:val="0"/>
         </w:rPr>
         <w:t>An IT services and digital transformation company (public sector, healthcare, industry); 30 offices; ISO 9001 and ISO/IEC 27001</w:t>
       </w:r>
-      <w:hyperlink r:id="rId10">
+      <w:hyperlink r:id="rId12">
         <w:r>
           <w:rPr>
             <w:color w:val="2A78D6"/>
@@ -956,16 +1457,28 @@
     </w:p>
     <w:p>
       <w:pPr>
-        <w:pStyle w:val="ListBullet"/>
-        <w:spacing w:after="60"/>
+        <w:tabs>
+          <w:tab w:pos="255" w:val="left"/>
+        </w:tabs>
+        <w:spacing w:before="0" w:after="80"/>
+        <w:ind w:left="255" w:hanging="255"/>
       </w:pPr>
+      <w:r>
+        <w:rPr>
+          <w:b/>
+          <w:color w:val="2A78D6"/>
+          <w:sz w:val="20"/>
+        </w:rPr>
+        <w:t>▪</w:t>
+        <w:tab/>
+      </w:r>
       <w:r>
         <w:rPr>
           <w:b w:val="0"/>
         </w:rPr>
         <w:t>In 2025 Nortal became an approved NATO supplier; it targets 70% 'AI-first' delivery by end-2026</w:t>
       </w:r>
-      <w:hyperlink r:id="rId11">
+      <w:hyperlink r:id="rId13">
         <w:r>
           <w:rPr>
             <w:color w:val="2A78D6"/>
@@ -984,11 +1497,24 @@
     </w:p>
     <w:p>
       <w:pPr>
-        <w:spacing w:before="280" w:after="80"/>
+        <w:keepNext/>
         <w:pBdr>
-          <w:bottom w:val="single" w:sz="6" w:color="C9D3DE" w:space="2"/>
+          <w:bottom w:val="single" w:sz="8" w:color="1F4E79" w:space="4"/>
         </w:pBdr>
+        <w:tabs>
+          <w:tab w:pos="482" w:val="left"/>
+        </w:tabs>
+        <w:spacing w:before="360" w:after="160"/>
       </w:pPr>
+      <w:r>
+        <w:rPr>
+          <w:b/>
+          <w:color w:val="2A78D6"/>
+          <w:sz w:val="18"/>
+        </w:rPr>
+        <w:t>05</w:t>
+        <w:tab/>
+      </w:r>
       <w:r>
         <w:rPr>
           <w:b/>
@@ -1000,16 +1526,28 @@
     </w:p>
     <w:p>
       <w:pPr>
-        <w:pStyle w:val="ListBullet"/>
-        <w:spacing w:after="60"/>
+        <w:tabs>
+          <w:tab w:pos="255" w:val="left"/>
+        </w:tabs>
+        <w:spacing w:before="0" w:after="80"/>
+        <w:ind w:left="255" w:hanging="255"/>
       </w:pPr>
+      <w:r>
+        <w:rPr>
+          <w:b/>
+          <w:color w:val="2A78D6"/>
+          <w:sz w:val="20"/>
+        </w:rPr>
+        <w:t>▪</w:t>
+        <w:tab/>
+      </w:r>
       <w:r>
         <w:rPr>
           <w:b w:val="0"/>
         </w:rPr>
         <w:t>Net profit, net debt, equity and cash – not found (not public)</w:t>
       </w:r>
-      <w:hyperlink r:id="rId10">
+      <w:hyperlink r:id="rId12">
         <w:r>
           <w:rPr>
             <w:color w:val="2A78D6"/>
@@ -1028,11 +1566,24 @@
     </w:p>
     <w:p>
       <w:pPr>
-        <w:spacing w:before="280" w:after="80"/>
+        <w:keepNext/>
         <w:pBdr>
-          <w:bottom w:val="single" w:sz="6" w:color="C9D3DE" w:space="2"/>
+          <w:bottom w:val="single" w:sz="8" w:color="1F4E79" w:space="4"/>
         </w:pBdr>
+        <w:tabs>
+          <w:tab w:pos="482" w:val="left"/>
+        </w:tabs>
+        <w:spacing w:before="360" w:after="160"/>
       </w:pPr>
+      <w:r>
+        <w:rPr>
+          <w:b/>
+          <w:color w:val="2A78D6"/>
+          <w:sz w:val="18"/>
+        </w:rPr>
+        <w:t>06</w:t>
+        <w:tab/>
+      </w:r>
       <w:r>
         <w:rPr>
           <w:b/>
@@ -1044,36 +1595,52 @@
     </w:p>
     <w:tbl>
       <w:tblPr>
-        <w:tblW w:type="auto" w:w="0"/>
+        <w:tblW w:w="9638" w:type="dxa"/>
+        <w:tblBorders>
+          <w:top w:val="nil"/>
+          <w:left w:val="nil"/>
+          <w:bottom w:val="nil"/>
+          <w:right w:val="nil"/>
+          <w:insideH w:val="nil"/>
+          <w:insideV w:val="nil"/>
+        </w:tblBorders>
+        <w:tblLayout w:type="fixed"/>
+        <w:tblCellMar>
+          <w:top w:w="70" w:type="dxa"/>
+          <w:left w:w="100" w:type="dxa"/>
+          <w:bottom w:w="70" w:type="dxa"/>
+          <w:right w:w="100" w:type="dxa"/>
+        </w:tblCellMar>
         <w:tblLook w:firstColumn="1" w:firstRow="1" w:lastColumn="0" w:lastRow="0" w:noHBand="0" w:noVBand="1" w:val="04A0"/>
-        <w:tblBorders>
-          <w:top w:val="single" w:sz="4" w:color="C9D3DE"/>
-          <w:left w:val="nil"/>
-          <w:bottom w:val="single" w:sz="4" w:color="C9D3DE"/>
-          <w:right w:val="nil"/>
-          <w:insideH w:val="single" w:sz="4" w:color="C9D3DE"/>
-          <w:insideV w:val="nil"/>
-        </w:tblBorders>
       </w:tblPr>
       <w:tblGrid>
-        <w:gridCol w:w="2493"/>
-        <w:gridCol w:w="2493"/>
-        <w:gridCol w:w="2493"/>
-        <w:gridCol w:w="2493"/>
+        <w:gridCol w:w="2577"/>
+        <w:gridCol w:w="2577"/>
+        <w:gridCol w:w="3138"/>
+        <w:gridCol w:w="1344"/>
       </w:tblGrid>
       <w:tr>
         <w:tc>
           <w:tcPr>
-            <w:tcW w:type="dxa" w:w="2608"/>
-            <w:shd w:val="clear" w:color="auto" w:fill="1F4E79"/>
+            <w:tcW w:type="dxa" w:w="2578"/>
+            <w:tcBorders>
+              <w:top w:val="single" w:sz="12" w:color="1F4E79" w:space="0"/>
+              <w:left w:val="nil"/>
+              <w:bottom w:val="single" w:sz="4" w:color="C9D3DE" w:space="0"/>
+              <w:right w:val="nil"/>
+            </w:tcBorders>
+            <w:shd w:val="clear" w:color="auto" w:fill="EAF1F8"/>
           </w:tcPr>
           <w:p>
-            <w:r/>
+            <w:pPr>
+              <w:spacing w:before="0" w:after="0"/>
+            </w:pPr>
             <w:r>
               <w:rPr>
                 <w:b/>
-                <w:color w:val="FFFFFF"/>
-                <w:sz w:val="17"/>
+                <w:caps/>
+                <w:color w:val="1F4E79"/>
+                <w:sz w:val="16"/>
               </w:rPr>
               <w:t>Plan / target</w:t>
             </w:r>
@@ -1081,16 +1648,25 @@
         </w:tc>
         <w:tc>
           <w:tcPr>
-            <w:tcW w:type="dxa" w:w="2608"/>
-            <w:shd w:val="clear" w:color="auto" w:fill="1F4E79"/>
+            <w:tcW w:type="dxa" w:w="2578"/>
+            <w:tcBorders>
+              <w:top w:val="single" w:sz="12" w:color="1F4E79" w:space="0"/>
+              <w:left w:val="nil"/>
+              <w:bottom w:val="single" w:sz="4" w:color="C9D3DE" w:space="0"/>
+              <w:right w:val="nil"/>
+            </w:tcBorders>
+            <w:shd w:val="clear" w:color="auto" w:fill="EAF1F8"/>
           </w:tcPr>
           <w:p>
-            <w:r/>
+            <w:pPr>
+              <w:spacing w:before="0" w:after="0"/>
+            </w:pPr>
             <w:r>
               <w:rPr>
                 <w:b/>
-                <w:color w:val="FFFFFF"/>
-                <w:sz w:val="17"/>
+                <w:caps/>
+                <w:color w:val="1F4E79"/>
+                <w:sz w:val="16"/>
               </w:rPr>
               <w:t>Outcome</w:t>
             </w:r>
@@ -1098,16 +1674,25 @@
         </w:tc>
         <w:tc>
           <w:tcPr>
-            <w:tcW w:type="dxa" w:w="3175"/>
-            <w:shd w:val="clear" w:color="auto" w:fill="1F4E79"/>
+            <w:tcW w:type="dxa" w:w="3138"/>
+            <w:tcBorders>
+              <w:top w:val="single" w:sz="12" w:color="1F4E79" w:space="0"/>
+              <w:left w:val="nil"/>
+              <w:bottom w:val="single" w:sz="4" w:color="C9D3DE" w:space="0"/>
+              <w:right w:val="nil"/>
+            </w:tcBorders>
+            <w:shd w:val="clear" w:color="auto" w:fill="EAF1F8"/>
           </w:tcPr>
           <w:p>
-            <w:r/>
+            <w:pPr>
+              <w:spacing w:before="0" w:after="0"/>
+            </w:pPr>
             <w:r>
               <w:rPr>
                 <w:b/>
-                <w:color w:val="FFFFFF"/>
-                <w:sz w:val="17"/>
+                <w:caps/>
+                <w:color w:val="1F4E79"/>
+                <w:sz w:val="16"/>
               </w:rPr>
               <w:t>What changed and why</w:t>
             </w:r>
@@ -1115,16 +1700,25 @@
         </w:tc>
         <w:tc>
           <w:tcPr>
-            <w:tcW w:type="dxa" w:w="1361"/>
-            <w:shd w:val="clear" w:color="auto" w:fill="1F4E79"/>
+            <w:tcW w:type="dxa" w:w="1345"/>
+            <w:tcBorders>
+              <w:top w:val="single" w:sz="12" w:color="1F4E79" w:space="0"/>
+              <w:left w:val="nil"/>
+              <w:bottom w:val="single" w:sz="4" w:color="C9D3DE" w:space="0"/>
+              <w:right w:val="nil"/>
+            </w:tcBorders>
+            <w:shd w:val="clear" w:color="auto" w:fill="EAF1F8"/>
           </w:tcPr>
           <w:p>
-            <w:r/>
+            <w:pPr>
+              <w:spacing w:before="0" w:after="0"/>
+            </w:pPr>
             <w:r>
               <w:rPr>
                 <w:b/>
-                <w:color w:val="FFFFFF"/>
-                <w:sz w:val="17"/>
+                <w:caps/>
+                <w:color w:val="1F4E79"/>
+                <w:sz w:val="16"/>
               </w:rPr>
               <w:t>Status</w:t>
             </w:r>
@@ -1134,13 +1728,18 @@
       <w:tr>
         <w:tc>
           <w:tcPr>
-            <w:tcW w:type="dxa" w:w="2608"/>
+            <w:tcW w:type="dxa" w:w="2578"/>
+            <w:tcBorders>
+              <w:top w:val="nil"/>
+              <w:left w:val="nil"/>
+              <w:bottom w:val="single" w:sz="4" w:color="DDE3EA" w:space="0"/>
+              <w:right w:val="nil"/>
+            </w:tcBorders>
           </w:tcPr>
           <w:p>
             <w:pPr>
-              <w:spacing w:after="0"/>
+              <w:spacing w:before="0" w:after="0"/>
             </w:pPr>
-            <w:r/>
             <w:r>
               <w:rPr>
                 <w:b w:val="0"/>
@@ -1152,13 +1751,18 @@
         </w:tc>
         <w:tc>
           <w:tcPr>
-            <w:tcW w:type="dxa" w:w="2608"/>
+            <w:tcW w:type="dxa" w:w="2578"/>
+            <w:tcBorders>
+              <w:top w:val="nil"/>
+              <w:left w:val="nil"/>
+              <w:bottom w:val="single" w:sz="4" w:color="DDE3EA" w:space="0"/>
+              <w:right w:val="nil"/>
+            </w:tcBorders>
           </w:tcPr>
           <w:p>
             <w:pPr>
-              <w:spacing w:after="0"/>
+              <w:spacing w:before="0" w:after="0"/>
             </w:pPr>
-            <w:r/>
             <w:r>
               <w:rPr>
                 <w:b w:val="0"/>
@@ -1166,7 +1770,7 @@
               </w:rPr>
               <w:t>New target</w:t>
             </w:r>
-            <w:hyperlink r:id="rId11">
+            <w:hyperlink r:id="rId13">
               <w:r>
                 <w:rPr>
                   <w:color w:val="2A78D6"/>
@@ -1180,13 +1784,18 @@
         </w:tc>
         <w:tc>
           <w:tcPr>
-            <w:tcW w:type="dxa" w:w="3175"/>
+            <w:tcW w:type="dxa" w:w="3138"/>
+            <w:tcBorders>
+              <w:top w:val="nil"/>
+              <w:left w:val="nil"/>
+              <w:bottom w:val="single" w:sz="4" w:color="DDE3EA" w:space="0"/>
+              <w:right w:val="nil"/>
+            </w:tcBorders>
           </w:tcPr>
           <w:p>
             <w:pPr>
-              <w:spacing w:after="0"/>
+              <w:spacing w:before="0" w:after="0"/>
             </w:pPr>
-            <w:r/>
             <w:r>
               <w:rPr>
                 <w:b w:val="0"/>
@@ -1194,7 +1803,7 @@
               </w:rPr>
               <w:t>New</w:t>
             </w:r>
-            <w:hyperlink r:id="rId11">
+            <w:hyperlink r:id="rId13">
               <w:r>
                 <w:rPr>
                   <w:color w:val="2A78D6"/>
@@ -1215,14 +1824,19 @@
         </w:tc>
         <w:tc>
           <w:tcPr>
-            <w:tcW w:type="dxa" w:w="1361"/>
+            <w:tcW w:type="dxa" w:w="1345"/>
+            <w:tcBorders>
+              <w:top w:val="nil"/>
+              <w:left w:val="nil"/>
+              <w:bottom w:val="single" w:sz="4" w:color="DDE3EA" w:space="0"/>
+              <w:right w:val="nil"/>
+            </w:tcBorders>
             <w:shd w:val="clear" w:color="auto" w:fill="EAF1F8"/>
           </w:tcPr>
           <w:p>
             <w:pPr>
-              <w:spacing w:after="0"/>
+              <w:spacing w:before="0" w:after="0"/>
             </w:pPr>
-            <w:r/>
             <w:r>
               <w:rPr>
                 <w:b/>
@@ -1236,11 +1850,29 @@
     </w:tbl>
     <w:p>
       <w:pPr>
-        <w:spacing w:before="280" w:after="80"/>
+        <w:spacing w:before="0" w:after="40"/>
+      </w:pPr>
+    </w:p>
+    <w:p>
+      <w:pPr>
+        <w:keepNext/>
         <w:pBdr>
-          <w:bottom w:val="single" w:sz="6" w:color="C9D3DE" w:space="2"/>
+          <w:bottom w:val="single" w:sz="8" w:color="1F4E79" w:space="4"/>
         </w:pBdr>
+        <w:tabs>
+          <w:tab w:pos="482" w:val="left"/>
+        </w:tabs>
+        <w:spacing w:before="360" w:after="160"/>
       </w:pPr>
+      <w:r>
+        <w:rPr>
+          <w:b/>
+          <w:color w:val="2A78D6"/>
+          <w:sz w:val="18"/>
+        </w:rPr>
+        <w:t>07</w:t>
+        <w:tab/>
+      </w:r>
       <w:r>
         <w:rPr>
           <w:b/>
@@ -1252,9 +1884,21 @@
     </w:p>
     <w:p>
       <w:pPr>
-        <w:pStyle w:val="ListBullet"/>
-        <w:spacing w:after="60"/>
+        <w:tabs>
+          <w:tab w:pos="255" w:val="left"/>
+        </w:tabs>
+        <w:spacing w:before="0" w:after="80"/>
+        <w:ind w:left="255" w:hanging="255"/>
       </w:pPr>
+      <w:r>
+        <w:rPr>
+          <w:b/>
+          <w:color w:val="2A78D6"/>
+          <w:sz w:val="20"/>
+        </w:rPr>
+        <w:t>▪</w:t>
+        <w:tab/>
+      </w:r>
       <w:r>
         <w:rPr>
           <w:b/>
@@ -1267,7 +1911,7 @@
         </w:rPr>
         <w:t xml:space="preserve"> secured floating rate notes FI4000566567, maturing 2029-02-09. Publicly: a EUR 50m five-year senior secured FRN was issued on 2024-02-09 (framework up to EUR 100m), with quarterly interest, to refinance older bonds</w:t>
       </w:r>
-      <w:hyperlink r:id="rId14">
+      <w:hyperlink r:id="rId16">
         <w:r>
           <w:rPr>
             <w:color w:val="2A78D6"/>
@@ -1284,7 +1928,7 @@
         </w:rPr>
         <w:t>,</w:t>
       </w:r>
-      <w:hyperlink r:id="rId15">
+      <w:hyperlink r:id="rId17">
         <w:r>
           <w:rPr>
             <w:color w:val="2A78D6"/>
@@ -1303,9 +1947,21 @@
     </w:p>
     <w:p>
       <w:pPr>
-        <w:pStyle w:val="ListBullet"/>
-        <w:spacing w:after="60"/>
+        <w:tabs>
+          <w:tab w:pos="255" w:val="left"/>
+        </w:tabs>
+        <w:spacing w:before="0" w:after="80"/>
+        <w:ind w:left="255" w:hanging="255"/>
       </w:pPr>
+      <w:r>
+        <w:rPr>
+          <w:b/>
+          <w:color w:val="2A78D6"/>
+          <w:sz w:val="20"/>
+        </w:rPr>
+        <w:t>▪</w:t>
+        <w:tab/>
+      </w:r>
       <w:r>
         <w:rPr>
           <w:b/>
@@ -1321,9 +1977,21 @@
     </w:p>
     <w:p>
       <w:pPr>
-        <w:pStyle w:val="ListBullet"/>
-        <w:spacing w:after="60"/>
+        <w:tabs>
+          <w:tab w:pos="255" w:val="left"/>
+        </w:tabs>
+        <w:spacing w:before="0" w:after="80"/>
+        <w:ind w:left="255" w:hanging="255"/>
       </w:pPr>
+      <w:r>
+        <w:rPr>
+          <w:b/>
+          <w:color w:val="2A78D6"/>
+          <w:sz w:val="20"/>
+        </w:rPr>
+        <w:t>▪</w:t>
+        <w:tab/>
+      </w:r>
       <w:r>
         <w:rPr>
           <w:b/>
@@ -1339,11 +2007,66 @@
     </w:p>
     <w:p>
       <w:pPr>
-        <w:spacing w:before="280" w:after="80"/>
+        <w:keepNext/>
         <w:pBdr>
-          <w:bottom w:val="single" w:sz="6" w:color="C9D3DE" w:space="2"/>
+          <w:bottom w:val="single" w:sz="8" w:color="1F4E79" w:space="4"/>
         </w:pBdr>
+        <w:tabs>
+          <w:tab w:pos="482" w:val="left"/>
+        </w:tabs>
+        <w:spacing w:before="360" w:after="160"/>
       </w:pPr>
+      <w:r>
+        <w:rPr>
+          <w:b/>
+          <w:color w:val="2A78D6"/>
+          <w:sz w:val="18"/>
+        </w:rPr>
+        <w:t>08</w:t>
+        <w:tab/>
+      </w:r>
+      <w:r>
+        <w:rPr>
+          <w:b/>
+          <w:color w:val="1F4E79"/>
+          <w:sz w:val="28"/>
+        </w:rPr>
+        <w:t>In the press</w:t>
+      </w:r>
+    </w:p>
+    <w:p>
+      <w:pPr>
+        <w:spacing w:before="40" w:after="60"/>
+      </w:pPr>
+      <w:r>
+        <w:rPr>
+          <w:b w:val="0"/>
+          <w:color w:val="5F6B7A"/>
+          <w:sz w:val="18"/>
+        </w:rPr>
+        <w:t>No news about the issuer found in this period.</w:t>
+      </w:r>
+    </w:p>
+    <w:p>
+      <w:pPr>
+        <w:keepNext/>
+        <w:pBdr>
+          <w:bottom w:val="single" w:sz="8" w:color="1F4E79" w:space="4"/>
+        </w:pBdr>
+        <w:tabs>
+          <w:tab w:pos="482" w:val="left"/>
+        </w:tabs>
+        <w:spacing w:before="360" w:after="160"/>
+      </w:pPr>
+      <w:r>
+        <w:rPr>
+          <w:b/>
+          <w:color w:val="2A78D6"/>
+          <w:sz w:val="18"/>
+        </w:rPr>
+        <w:t>09</w:t>
+        <w:tab/>
+      </w:r>
       <w:r>
         <w:rPr>
           <w:b/>
@@ -1355,791 +2078,1569 @@
     </w:p>
     <w:p>
       <w:pPr>
-        <w:spacing w:before="160"/>
+        <w:keepNext/>
+        <w:shd w:val="clear" w:color="auto" w:fill="EAF1F8"/>
+        <w:spacing w:before="200" w:after="80"/>
+        <w:ind w:left="85"/>
       </w:pPr>
       <w:r>
         <w:rPr>
           <w:b/>
-          <w:sz w:val="22"/>
+          <w:caps/>
+          <w:color w:val="1F4E79"/>
+          <w:sz w:val="19"/>
         </w:rPr>
         <w:t>Exclusionary screening (companies)</w:t>
       </w:r>
     </w:p>
+    <w:tbl>
+      <w:tblPr>
+        <w:tblW w:w="9639" w:type="dxa"/>
+        <w:tblBorders>
+          <w:top w:val="nil"/>
+          <w:left w:val="nil"/>
+          <w:bottom w:val="nil"/>
+          <w:right w:val="nil"/>
+          <w:insideH w:val="nil"/>
+          <w:insideV w:val="nil"/>
+        </w:tblBorders>
+        <w:tblLayout w:type="fixed"/>
+        <w:tblCellMar>
+          <w:top w:w="90" w:type="dxa"/>
+          <w:left w:w="0" w:type="dxa"/>
+          <w:bottom w:w="110" w:type="dxa"/>
+          <w:right w:w="0" w:type="dxa"/>
+        </w:tblCellMar>
+        <w:tblLook w:firstColumn="1" w:firstRow="1" w:lastColumn="0" w:lastRow="0" w:noHBand="0" w:noVBand="1" w:val="04A0"/>
+      </w:tblPr>
+      <w:tblGrid>
+        <w:gridCol w:w="340"/>
+        <w:gridCol w:w="9298"/>
+      </w:tblGrid>
+      <w:tr>
+        <w:tc>
+          <w:tcPr>
+            <w:tcW w:type="dxa" w:w="340"/>
+            <w:tcBorders>
+              <w:top w:val="nil"/>
+              <w:left w:val="nil"/>
+              <w:bottom w:val="single" w:sz="4" w:color="E3E8EE" w:space="0"/>
+              <w:right w:val="nil"/>
+            </w:tcBorders>
+          </w:tcPr>
+          <w:p>
+            <w:pPr>
+              <w:spacing w:before="0" w:after="0"/>
+            </w:pPr>
+            <w:r>
+              <w:rPr>
+                <w:rFonts w:ascii="Segoe UI Symbol" w:hAnsi="Segoe UI Symbol"/>
+                <w:b w:val="0"/>
+                <w:color w:val="1B7F3B"/>
+                <w:sz w:val="24"/>
+              </w:rPr>
+              <w:t>☑</w:t>
+            </w:r>
+          </w:p>
+        </w:tc>
+        <w:tc>
+          <w:tcPr>
+            <w:tcW w:type="dxa" w:w="9298"/>
+            <w:tcBorders>
+              <w:top w:val="nil"/>
+              <w:left w:val="nil"/>
+              <w:bottom w:val="single" w:sz="4" w:color="E3E8EE" w:space="0"/>
+              <w:right w:val="nil"/>
+            </w:tcBorders>
+          </w:tcPr>
+          <w:p>
+            <w:pPr>
+              <w:spacing w:before="0" w:after="40"/>
+            </w:pPr>
+            <w:r>
+              <w:rPr>
+                <w:b/>
+                <w:color w:val="1A1A1A"/>
+                <w:sz w:val="19"/>
+              </w:rPr>
+              <w:t>Yes, the company is not involved in excluded sectors: controversial and nuclear weapons, tobacco, gambling and restricted sectors in fossil fuel</w:t>
+            </w:r>
+          </w:p>
+          <w:p>
+            <w:pPr>
+              <w:tabs>
+                <w:tab w:pos="198" w:val="left"/>
+              </w:tabs>
+              <w:spacing w:before="0" w:after="20"/>
+              <w:ind w:left="198" w:hanging="198"/>
+            </w:pPr>
+            <w:r>
+              <w:rPr>
+                <w:b w:val="0"/>
+                <w:color w:val="5F6B7A"/>
+                <w:sz w:val="18"/>
+              </w:rPr>
+              <w:t>•</w:t>
+              <w:tab/>
+            </w:r>
+            <w:r>
+              <w:rPr>
+                <w:b w:val="0"/>
+                <w:color w:val="333333"/>
+                <w:sz w:val="18"/>
+              </w:rPr>
+              <w:t>IT services</w:t>
+            </w:r>
+          </w:p>
+          <w:p>
+            <w:pPr>
+              <w:tabs>
+                <w:tab w:pos="198" w:val="left"/>
+              </w:tabs>
+              <w:spacing w:before="0" w:after="20"/>
+              <w:ind w:left="198" w:hanging="198"/>
+            </w:pPr>
+            <w:r>
+              <w:rPr>
+                <w:b w:val="0"/>
+                <w:color w:val="5F6B7A"/>
+                <w:sz w:val="18"/>
+              </w:rPr>
+              <w:t>•</w:t>
+              <w:tab/>
+            </w:r>
+            <w:r>
+              <w:rPr>
+                <w:b w:val="0"/>
+                <w:color w:val="333333"/>
+                <w:sz w:val="18"/>
+              </w:rPr>
+              <w:t>No activity in excluded sectors.</w:t>
+            </w:r>
+          </w:p>
+          <w:p>
+            <w:pPr>
+              <w:tabs>
+                <w:tab w:pos="198" w:val="left"/>
+              </w:tabs>
+              <w:spacing w:before="0" w:after="20"/>
+              <w:ind w:left="198" w:hanging="198"/>
+            </w:pPr>
+            <w:r>
+              <w:rPr>
+                <w:b w:val="0"/>
+                <w:color w:val="5F6B7A"/>
+                <w:sz w:val="18"/>
+              </w:rPr>
+              <w:t>•</w:t>
+              <w:tab/>
+            </w:r>
+            <w:r>
+              <w:rPr>
+                <w:b w:val="0"/>
+                <w:color w:val="333333"/>
+                <w:sz w:val="18"/>
+              </w:rPr>
+              <w:t>Provides IT services to defence (NATO supplier), not weapons</w:t>
+            </w:r>
+            <w:hyperlink r:id="rId12">
+              <w:r>
+                <w:rPr>
+                  <w:color w:val="2A78D6"/>
+                  <w:vertAlign w:val="superscript"/>
+                  <w:sz w:val="15"/>
+                </w:rPr>
+                <w:t xml:space="preserve">1</w:t>
+              </w:r>
+            </w:hyperlink>
+            <w:r>
+              <w:rPr>
+                <w:color w:val="2A78D6"/>
+                <w:vertAlign w:val="superscript"/>
+              </w:rPr>
+              <w:t>,</w:t>
+            </w:r>
+            <w:hyperlink r:id="rId13">
+              <w:r>
+                <w:rPr>
+                  <w:color w:val="2A78D6"/>
+                  <w:vertAlign w:val="superscript"/>
+                  <w:sz w:val="15"/>
+                </w:rPr>
+                <w:t xml:space="preserve">2</w:t>
+              </w:r>
+            </w:hyperlink>
+            <w:r>
+              <w:rPr>
+                <w:b w:val="0"/>
+                <w:color w:val="333333"/>
+                <w:sz w:val="18"/>
+              </w:rPr>
+              <w:t>.</w:t>
+            </w:r>
+          </w:p>
+        </w:tc>
+      </w:tr>
+    </w:tbl>
+    <w:tbl>
+      <w:tblPr>
+        <w:tblW w:w="9639" w:type="dxa"/>
+        <w:tblBorders>
+          <w:top w:val="nil"/>
+          <w:left w:val="nil"/>
+          <w:bottom w:val="nil"/>
+          <w:right w:val="nil"/>
+          <w:insideH w:val="nil"/>
+          <w:insideV w:val="nil"/>
+        </w:tblBorders>
+        <w:tblLayout w:type="fixed"/>
+        <w:tblCellMar>
+          <w:top w:w="90" w:type="dxa"/>
+          <w:left w:w="0" w:type="dxa"/>
+          <w:bottom w:w="110" w:type="dxa"/>
+          <w:right w:w="0" w:type="dxa"/>
+        </w:tblCellMar>
+        <w:tblLook w:firstColumn="1" w:firstRow="1" w:lastColumn="0" w:lastRow="0" w:noHBand="0" w:noVBand="1" w:val="04A0"/>
+      </w:tblPr>
+      <w:tblGrid>
+        <w:gridCol w:w="340"/>
+        <w:gridCol w:w="9298"/>
+      </w:tblGrid>
+      <w:tr>
+        <w:tc>
+          <w:tcPr>
+            <w:tcW w:type="dxa" w:w="340"/>
+            <w:tcBorders>
+              <w:top w:val="nil"/>
+              <w:left w:val="nil"/>
+              <w:bottom w:val="single" w:sz="4" w:color="E3E8EE" w:space="0"/>
+              <w:right w:val="nil"/>
+            </w:tcBorders>
+          </w:tcPr>
+          <w:p>
+            <w:pPr>
+              <w:spacing w:before="0" w:after="0"/>
+            </w:pPr>
+            <w:r>
+              <w:rPr>
+                <w:rFonts w:ascii="Segoe UI Symbol" w:hAnsi="Segoe UI Symbol"/>
+                <w:b w:val="0"/>
+                <w:color w:val="1B7F3B"/>
+                <w:sz w:val="24"/>
+              </w:rPr>
+              <w:t>☑</w:t>
+            </w:r>
+          </w:p>
+        </w:tc>
+        <w:tc>
+          <w:tcPr>
+            <w:tcW w:type="dxa" w:w="9298"/>
+            <w:tcBorders>
+              <w:top w:val="nil"/>
+              <w:left w:val="nil"/>
+              <w:bottom w:val="single" w:sz="4" w:color="E3E8EE" w:space="0"/>
+              <w:right w:val="nil"/>
+            </w:tcBorders>
+          </w:tcPr>
+          <w:p>
+            <w:pPr>
+              <w:spacing w:before="0" w:after="40"/>
+            </w:pPr>
+            <w:r>
+              <w:rPr>
+                <w:b/>
+                <w:color w:val="1A1A1A"/>
+                <w:sz w:val="19"/>
+              </w:rPr>
+              <w:t>Yes, the company does not have red flag/signal related to controversies based on UN Global Compact, OECD Guidelines for Multinational Enterprises or any other relevant principles/standards</w:t>
+            </w:r>
+          </w:p>
+          <w:p>
+            <w:pPr>
+              <w:tabs>
+                <w:tab w:pos="198" w:val="left"/>
+              </w:tabs>
+              <w:spacing w:before="0" w:after="20"/>
+              <w:ind w:left="198" w:hanging="198"/>
+            </w:pPr>
+            <w:r>
+              <w:rPr>
+                <w:b w:val="0"/>
+                <w:color w:val="5F6B7A"/>
+                <w:sz w:val="18"/>
+              </w:rPr>
+              <w:t>•</w:t>
+              <w:tab/>
+            </w:r>
+            <w:r>
+              <w:rPr>
+                <w:b w:val="0"/>
+                <w:color w:val="333333"/>
+                <w:sz w:val="18"/>
+              </w:rPr>
+              <w:t>No UN Global Compact or OECD related controversies found.</w:t>
+            </w:r>
+          </w:p>
+        </w:tc>
+      </w:tr>
+    </w:tbl>
+    <w:tbl>
+      <w:tblPr>
+        <w:tblW w:w="9639" w:type="dxa"/>
+        <w:tblBorders>
+          <w:top w:val="nil"/>
+          <w:left w:val="nil"/>
+          <w:bottom w:val="nil"/>
+          <w:right w:val="nil"/>
+          <w:insideH w:val="nil"/>
+          <w:insideV w:val="nil"/>
+        </w:tblBorders>
+        <w:tblLayout w:type="fixed"/>
+        <w:tblCellMar>
+          <w:top w:w="90" w:type="dxa"/>
+          <w:left w:w="0" w:type="dxa"/>
+          <w:bottom w:w="110" w:type="dxa"/>
+          <w:right w:w="0" w:type="dxa"/>
+        </w:tblCellMar>
+        <w:tblLook w:firstColumn="1" w:firstRow="1" w:lastColumn="0" w:lastRow="0" w:noHBand="0" w:noVBand="1" w:val="04A0"/>
+      </w:tblPr>
+      <w:tblGrid>
+        <w:gridCol w:w="340"/>
+        <w:gridCol w:w="9298"/>
+      </w:tblGrid>
+      <w:tr>
+        <w:tc>
+          <w:tcPr>
+            <w:tcW w:type="dxa" w:w="340"/>
+            <w:tcBorders>
+              <w:top w:val="nil"/>
+              <w:left w:val="nil"/>
+              <w:bottom w:val="single" w:sz="4" w:color="E3E8EE" w:space="0"/>
+              <w:right w:val="nil"/>
+            </w:tcBorders>
+          </w:tcPr>
+          <w:p>
+            <w:pPr>
+              <w:spacing w:before="0" w:after="0"/>
+            </w:pPr>
+            <w:r>
+              <w:rPr>
+                <w:rFonts w:ascii="Segoe UI Symbol" w:hAnsi="Segoe UI Symbol"/>
+                <w:b w:val="0"/>
+                <w:color w:val="1B7F3B"/>
+                <w:sz w:val="24"/>
+              </w:rPr>
+              <w:t>☑</w:t>
+            </w:r>
+          </w:p>
+        </w:tc>
+        <w:tc>
+          <w:tcPr>
+            <w:tcW w:type="dxa" w:w="9298"/>
+            <w:tcBorders>
+              <w:top w:val="nil"/>
+              <w:left w:val="nil"/>
+              <w:bottom w:val="single" w:sz="4" w:color="E3E8EE" w:space="0"/>
+              <w:right w:val="nil"/>
+            </w:tcBorders>
+          </w:tcPr>
+          <w:p>
+            <w:pPr>
+              <w:spacing w:before="0" w:after="40"/>
+            </w:pPr>
+            <w:r>
+              <w:rPr>
+                <w:b/>
+                <w:color w:val="1A1A1A"/>
+                <w:sz w:val="19"/>
+              </w:rPr>
+              <w:t>Yes, the company is not in the list of sanctions (add a screenshot)</w:t>
+            </w:r>
+          </w:p>
+          <w:p>
+            <w:pPr>
+              <w:tabs>
+                <w:tab w:pos="198" w:val="left"/>
+              </w:tabs>
+              <w:spacing w:before="0" w:after="20"/>
+              <w:ind w:left="198" w:hanging="198"/>
+            </w:pPr>
+            <w:r>
+              <w:rPr>
+                <w:b w:val="0"/>
+                <w:color w:val="5F6B7A"/>
+                <w:sz w:val="18"/>
+              </w:rPr>
+              <w:t>•</w:t>
+              <w:tab/>
+            </w:r>
+            <w:r>
+              <w:rPr>
+                <w:b w:val="0"/>
+                <w:color w:val="333333"/>
+                <w:sz w:val="18"/>
+              </w:rPr>
+              <w:t>Not found on the EU, UN, UK, US OFAC consolidated sanctions lists (automatic check 2026-10-22).</w:t>
+            </w:r>
+          </w:p>
+        </w:tc>
+      </w:tr>
+    </w:tbl>
+    <w:tbl>
+      <w:tblPr>
+        <w:tblW w:w="9639" w:type="dxa"/>
+        <w:tblBorders>
+          <w:top w:val="nil"/>
+          <w:left w:val="nil"/>
+          <w:bottom w:val="nil"/>
+          <w:right w:val="nil"/>
+          <w:insideH w:val="nil"/>
+          <w:insideV w:val="nil"/>
+        </w:tblBorders>
+        <w:tblLayout w:type="fixed"/>
+        <w:tblCellMar>
+          <w:top w:w="90" w:type="dxa"/>
+          <w:left w:w="0" w:type="dxa"/>
+          <w:bottom w:w="110" w:type="dxa"/>
+          <w:right w:w="0" w:type="dxa"/>
+        </w:tblCellMar>
+        <w:tblLook w:firstColumn="1" w:firstRow="1" w:lastColumn="0" w:lastRow="0" w:noHBand="0" w:noVBand="1" w:val="04A0"/>
+      </w:tblPr>
+      <w:tblGrid>
+        <w:gridCol w:w="340"/>
+        <w:gridCol w:w="9298"/>
+      </w:tblGrid>
+      <w:tr>
+        <w:tc>
+          <w:tcPr>
+            <w:tcW w:type="dxa" w:w="340"/>
+            <w:tcBorders>
+              <w:top w:val="nil"/>
+              <w:left w:val="nil"/>
+              <w:bottom w:val="single" w:sz="4" w:color="E3E8EE" w:space="0"/>
+              <w:right w:val="nil"/>
+            </w:tcBorders>
+          </w:tcPr>
+          <w:p>
+            <w:pPr>
+              <w:spacing w:before="0" w:after="0"/>
+            </w:pPr>
+            <w:r>
+              <w:rPr>
+                <w:rFonts w:ascii="Segoe UI Symbol" w:hAnsi="Segoe UI Symbol"/>
+                <w:b w:val="0"/>
+                <w:color w:val="1B7F3B"/>
+                <w:sz w:val="24"/>
+              </w:rPr>
+              <w:t>☑</w:t>
+            </w:r>
+          </w:p>
+        </w:tc>
+        <w:tc>
+          <w:tcPr>
+            <w:tcW w:type="dxa" w:w="9298"/>
+            <w:tcBorders>
+              <w:top w:val="nil"/>
+              <w:left w:val="nil"/>
+              <w:bottom w:val="single" w:sz="4" w:color="E3E8EE" w:space="0"/>
+              <w:right w:val="nil"/>
+            </w:tcBorders>
+          </w:tcPr>
+          <w:p>
+            <w:pPr>
+              <w:spacing w:before="0" w:after="40"/>
+            </w:pPr>
+            <w:r>
+              <w:rPr>
+                <w:b/>
+                <w:color w:val="1A1A1A"/>
+                <w:sz w:val="19"/>
+              </w:rPr>
+              <w:t>Yes, issues were not identified from adverse media checks (add a screenshot)</w:t>
+            </w:r>
+          </w:p>
+          <w:p>
+            <w:pPr>
+              <w:tabs>
+                <w:tab w:pos="198" w:val="left"/>
+              </w:tabs>
+              <w:spacing w:before="0" w:after="20"/>
+              <w:ind w:left="198" w:hanging="198"/>
+            </w:pPr>
+            <w:r>
+              <w:rPr>
+                <w:b w:val="0"/>
+                <w:color w:val="5F6B7A"/>
+                <w:sz w:val="18"/>
+              </w:rPr>
+              <w:t>•</w:t>
+              <w:tab/>
+            </w:r>
+            <w:r>
+              <w:rPr>
+                <w:b w:val="0"/>
+                <w:color w:val="333333"/>
+                <w:sz w:val="18"/>
+              </w:rPr>
+              <w:t>No new adverse news found (2026-10-22).</w:t>
+            </w:r>
+          </w:p>
+          <w:p>
+            <w:pPr>
+              <w:tabs>
+                <w:tab w:pos="198" w:val="left"/>
+              </w:tabs>
+              <w:spacing w:before="0" w:after="20"/>
+              <w:ind w:left="198" w:hanging="198"/>
+            </w:pPr>
+            <w:r>
+              <w:rPr>
+                <w:b w:val="0"/>
+                <w:color w:val="5F6B7A"/>
+                <w:sz w:val="18"/>
+              </w:rPr>
+              <w:t>•</w:t>
+              <w:tab/>
+            </w:r>
+            <w:r>
+              <w:rPr>
+                <w:b w:val="0"/>
+                <w:color w:val="333333"/>
+                <w:sz w:val="18"/>
+              </w:rPr>
+              <w:t>Earlier: in February 2024 Estonian parties criticised a possible conflict of interest over Nortal's role in the 'personal state' project</w:t>
+            </w:r>
+          </w:p>
+          <w:p>
+            <w:pPr>
+              <w:tabs>
+                <w:tab w:pos="198" w:val="left"/>
+              </w:tabs>
+              <w:spacing w:before="0" w:after="20"/>
+              <w:ind w:left="198" w:hanging="198"/>
+            </w:pPr>
+            <w:r>
+              <w:rPr>
+                <w:b w:val="0"/>
+                <w:color w:val="5F6B7A"/>
+                <w:sz w:val="18"/>
+              </w:rPr>
+              <w:t>•</w:t>
+              <w:tab/>
+            </w:r>
+            <w:r>
+              <w:rPr>
+                <w:b w:val="0"/>
+                <w:color w:val="333333"/>
+                <w:sz w:val="18"/>
+              </w:rPr>
+              <w:t>This was political criticism, not a fine or proceeding</w:t>
+            </w:r>
+            <w:hyperlink r:id="rId18">
+              <w:r>
+                <w:rPr>
+                  <w:color w:val="2A78D6"/>
+                  <w:vertAlign w:val="superscript"/>
+                  <w:sz w:val="15"/>
+                </w:rPr>
+                <w:t xml:space="preserve">6</w:t>
+              </w:r>
+            </w:hyperlink>
+            <w:r>
+              <w:rPr>
+                <w:b w:val="0"/>
+                <w:color w:val="333333"/>
+                <w:sz w:val="18"/>
+              </w:rPr>
+              <w:t>.</w:t>
+            </w:r>
+          </w:p>
+          <w:p>
+            <w:pPr>
+              <w:tabs>
+                <w:tab w:pos="198" w:val="left"/>
+              </w:tabs>
+              <w:spacing w:before="0" w:after="20"/>
+              <w:ind w:left="198" w:hanging="198"/>
+            </w:pPr>
+            <w:r>
+              <w:rPr>
+                <w:b w:val="0"/>
+                <w:color w:val="5F6B7A"/>
+                <w:sz w:val="18"/>
+              </w:rPr>
+              <w:t>•</w:t>
+              <w:tab/>
+            </w:r>
+            <w:r>
+              <w:rPr>
+                <w:b w:val="0"/>
+                <w:color w:val="333333"/>
+                <w:sz w:val="18"/>
+              </w:rPr>
+              <w:t>News summary 2026-07-24 – 2026-10-22: 0 articles, 0 with an adverse keyword in the headline (details in the section "In the press").</w:t>
+            </w:r>
+          </w:p>
+        </w:tc>
+      </w:tr>
+    </w:tbl>
     <w:p>
       <w:pPr>
-        <w:spacing w:before="80" w:after="20"/>
+        <w:spacing w:before="120" w:after="40"/>
       </w:pPr>
       <w:r>
         <w:rPr>
-          <w:sz w:val="24"/>
-        </w:rPr>
-        <w:t xml:space="preserve">☑ </w:t>
-      </w:r>
-      <w:r>
-        <w:t>Yes, the company is not involved in excluded sectors: controversial and nuclear weapons, tobacco, gambling and restricted sectors in fossil fuel</w:t>
-      </w:r>
-    </w:p>
-    <w:p>
-      <w:pPr>
-        <w:spacing w:after="0"/>
-        <w:ind w:left="510" w:hanging="198"/>
-      </w:pPr>
-      <w:r>
-        <w:rPr>
-          <w:sz w:val="19"/>
-        </w:rPr>
-        <w:t xml:space="preserve">•  </w:t>
-      </w:r>
-      <w:r>
-        <w:rPr>
-          <w:b w:val="0"/>
+          <w:i/>
           <w:color w:val="333333"/>
-          <w:sz w:val="19"/>
-        </w:rPr>
-        <w:t>IT services</w:t>
-      </w:r>
-    </w:p>
-    <w:p>
-      <w:pPr>
-        <w:spacing w:after="0"/>
-        <w:ind w:left="510" w:hanging="198"/>
-      </w:pPr>
-      <w:r>
-        <w:rPr>
-          <w:sz w:val="19"/>
-        </w:rPr>
-        <w:t xml:space="preserve">•  </w:t>
-      </w:r>
-      <w:r>
-        <w:rPr>
-          <w:b w:val="0"/>
-          <w:color w:val="333333"/>
-          <w:sz w:val="19"/>
-        </w:rPr>
-        <w:t>No activity in excluded sectors.</w:t>
-      </w:r>
-    </w:p>
-    <w:p>
-      <w:pPr>
-        <w:spacing w:after="120"/>
-        <w:ind w:left="510" w:hanging="198"/>
-      </w:pPr>
-      <w:r>
-        <w:rPr>
-          <w:sz w:val="19"/>
-        </w:rPr>
-        <w:t xml:space="preserve">•  </w:t>
-      </w:r>
-      <w:r>
-        <w:rPr>
-          <w:b w:val="0"/>
-          <w:color w:val="333333"/>
-          <w:sz w:val="19"/>
-        </w:rPr>
-        <w:t>Provides IT services to defence (NATO supplier), not weapons</w:t>
-      </w:r>
-      <w:hyperlink r:id="rId10">
-        <w:r>
-          <w:rPr>
-            <w:color w:val="2A78D6"/>
-            <w:vertAlign w:val="superscript"/>
-            <w:sz w:val="16"/>
-          </w:rPr>
-          <w:t xml:space="preserve">1</w:t>
-        </w:r>
-      </w:hyperlink>
-      <w:r>
-        <w:rPr>
-          <w:color w:val="2A78D6"/>
-          <w:vertAlign w:val="superscript"/>
-        </w:rPr>
-        <w:t>,</w:t>
-      </w:r>
-      <w:hyperlink r:id="rId11">
-        <w:r>
-          <w:rPr>
-            <w:color w:val="2A78D6"/>
-            <w:vertAlign w:val="superscript"/>
-            <w:sz w:val="16"/>
-          </w:rPr>
-          <w:t xml:space="preserve">2</w:t>
-        </w:r>
-      </w:hyperlink>
-      <w:r>
-        <w:rPr>
-          <w:b w:val="0"/>
-          <w:color w:val="333333"/>
-          <w:sz w:val="19"/>
-        </w:rPr>
-        <w:t>.</w:t>
-      </w:r>
-    </w:p>
-    <w:p>
-      <w:pPr>
-        <w:spacing w:before="80" w:after="20"/>
-      </w:pPr>
-      <w:r>
-        <w:rPr>
-          <w:sz w:val="24"/>
-        </w:rPr>
-        <w:t xml:space="preserve">☑ </w:t>
-      </w:r>
-      <w:r>
-        <w:t>Yes, the company does not have red flag/signal related to controversies based on UN Global Compact, OECD Guidelines for Multinational Enterprises or any other relevant principles/standards</w:t>
-      </w:r>
-    </w:p>
-    <w:p>
-      <w:pPr>
-        <w:spacing w:after="120"/>
-        <w:ind w:left="510" w:hanging="198"/>
-      </w:pPr>
-      <w:r>
-        <w:rPr>
-          <w:sz w:val="19"/>
-        </w:rPr>
-        <w:t xml:space="preserve">•  </w:t>
-      </w:r>
-      <w:r>
-        <w:rPr>
-          <w:b w:val="0"/>
-          <w:color w:val="333333"/>
-          <w:sz w:val="19"/>
-        </w:rPr>
-        <w:t>No UN Global Compact or OECD related controversies found.</w:t>
-      </w:r>
-    </w:p>
-    <w:p>
-      <w:pPr>
-        <w:spacing w:before="80" w:after="20"/>
-      </w:pPr>
-      <w:r>
-        <w:rPr>
-          <w:sz w:val="24"/>
-        </w:rPr>
-        <w:t xml:space="preserve">☑ </w:t>
-      </w:r>
-      <w:r>
-        <w:t>Yes, the company is not in the list of sanctions (add a screenshot)</w:t>
-      </w:r>
-    </w:p>
-    <w:p>
-      <w:pPr>
-        <w:spacing w:after="120"/>
-        <w:ind w:left="510" w:hanging="198"/>
-      </w:pPr>
-      <w:r>
-        <w:rPr>
-          <w:sz w:val="19"/>
-        </w:rPr>
-        <w:t xml:space="preserve">•  </w:t>
-      </w:r>
-      <w:r>
-        <w:rPr>
-          <w:b w:val="0"/>
-          <w:color w:val="333333"/>
-          <w:sz w:val="19"/>
-        </w:rPr>
-        <w:t>Not found on the EU, UN, UK, US OFAC consolidated sanctions lists (automatic check 2026-10-22).</w:t>
-      </w:r>
-    </w:p>
-    <w:p>
-      <w:pPr>
-        <w:spacing w:before="80" w:after="20"/>
-      </w:pPr>
-      <w:r>
-        <w:rPr>
-          <w:sz w:val="24"/>
-        </w:rPr>
-        <w:t xml:space="preserve">☑ </w:t>
-      </w:r>
-      <w:r>
-        <w:t>Yes, issues were not identified from adverse media checks (add a screenshot)</w:t>
-      </w:r>
-    </w:p>
-    <w:p>
-      <w:pPr>
-        <w:spacing w:after="0"/>
-        <w:ind w:left="510" w:hanging="198"/>
-      </w:pPr>
-      <w:r>
-        <w:rPr>
-          <w:sz w:val="19"/>
-        </w:rPr>
-        <w:t xml:space="preserve">•  </w:t>
-      </w:r>
-      <w:r>
-        <w:rPr>
-          <w:b w:val="0"/>
-          <w:color w:val="333333"/>
-          <w:sz w:val="19"/>
-        </w:rPr>
-        <w:t>No new adverse news found (2026-10-22).</w:t>
-      </w:r>
-    </w:p>
-    <w:p>
-      <w:pPr>
-        <w:spacing w:after="0"/>
-        <w:ind w:left="510" w:hanging="198"/>
-      </w:pPr>
-      <w:r>
-        <w:rPr>
-          <w:sz w:val="19"/>
-        </w:rPr>
-        <w:t xml:space="preserve">•  </w:t>
-      </w:r>
-      <w:r>
-        <w:rPr>
-          <w:b w:val="0"/>
-          <w:color w:val="333333"/>
-          <w:sz w:val="19"/>
-        </w:rPr>
-        <w:t>Earlier: in February 2024 Estonian parties criticised a possible conflict of interest over Nortal's role in the 'personal state' project</w:t>
-      </w:r>
-    </w:p>
-    <w:p>
-      <w:pPr>
-        <w:spacing w:after="120"/>
-        <w:ind w:left="510" w:hanging="198"/>
-      </w:pPr>
-      <w:r>
-        <w:rPr>
-          <w:sz w:val="19"/>
-        </w:rPr>
-        <w:t xml:space="preserve">•  </w:t>
-      </w:r>
-      <w:r>
-        <w:rPr>
-          <w:b w:val="0"/>
-          <w:color w:val="333333"/>
-          <w:sz w:val="19"/>
-        </w:rPr>
-        <w:t>This was political criticism, not a fine or proceeding</w:t>
-      </w:r>
-      <w:hyperlink r:id="rId16">
-        <w:r>
-          <w:rPr>
-            <w:color w:val="2A78D6"/>
-            <w:vertAlign w:val="superscript"/>
-            <w:sz w:val="16"/>
-          </w:rPr>
-          <w:t xml:space="preserve">6</w:t>
-        </w:r>
-      </w:hyperlink>
-      <w:r>
-        <w:rPr>
-          <w:b w:val="0"/>
-          <w:color w:val="333333"/>
-          <w:sz w:val="19"/>
-        </w:rPr>
-        <w:t>.</w:t>
-      </w:r>
-    </w:p>
-    <w:p>
-      <w:r>
-        <w:rPr>
-          <w:i/>
-          <w:sz w:val="19"/>
+          <w:sz w:val="18"/>
         </w:rPr>
         <w:t>In case any red flags, risks, unclarities were identified then additional checks (sanctions screening and adverse media checks) on the company’s Ultimate Beneficial Owners and/or senior management shall be performed.</w:t>
       </w:r>
     </w:p>
     <w:p>
       <w:pPr>
-        <w:spacing w:before="80"/>
+        <w:spacing w:before="120" w:after="40"/>
       </w:pPr>
       <w:r>
         <w:rPr>
           <w:b/>
+          <w:sz w:val="19"/>
         </w:rPr>
         <w:t xml:space="preserve">Additional comments: </w:t>
       </w:r>
     </w:p>
     <w:p>
       <w:pPr>
-        <w:spacing w:before="160"/>
+        <w:keepNext/>
+        <w:shd w:val="clear" w:color="auto" w:fill="EAF1F8"/>
+        <w:spacing w:before="200" w:after="80"/>
+        <w:ind w:left="85"/>
       </w:pPr>
       <w:r>
         <w:rPr>
           <w:b/>
-          <w:sz w:val="22"/>
+          <w:caps/>
+          <w:color w:val="1F4E79"/>
+          <w:sz w:val="19"/>
         </w:rPr>
         <w:t>ESG integration and positive screening (positive answers imply higher allocation)</w:t>
       </w:r>
     </w:p>
+    <w:tbl>
+      <w:tblPr>
+        <w:tblW w:w="9639" w:type="dxa"/>
+        <w:tblBorders>
+          <w:top w:val="nil"/>
+          <w:left w:val="nil"/>
+          <w:bottom w:val="nil"/>
+          <w:right w:val="nil"/>
+          <w:insideH w:val="nil"/>
+          <w:insideV w:val="nil"/>
+        </w:tblBorders>
+        <w:tblLayout w:type="fixed"/>
+        <w:tblCellMar>
+          <w:top w:w="90" w:type="dxa"/>
+          <w:left w:w="0" w:type="dxa"/>
+          <w:bottom w:w="110" w:type="dxa"/>
+          <w:right w:w="0" w:type="dxa"/>
+        </w:tblCellMar>
+        <w:tblLook w:firstColumn="1" w:firstRow="1" w:lastColumn="0" w:lastRow="0" w:noHBand="0" w:noVBand="1" w:val="04A0"/>
+      </w:tblPr>
+      <w:tblGrid>
+        <w:gridCol w:w="340"/>
+        <w:gridCol w:w="9298"/>
+      </w:tblGrid>
+      <w:tr>
+        <w:tc>
+          <w:tcPr>
+            <w:tcW w:type="dxa" w:w="340"/>
+            <w:tcBorders>
+              <w:top w:val="nil"/>
+              <w:left w:val="nil"/>
+              <w:bottom w:val="single" w:sz="4" w:color="E3E8EE" w:space="0"/>
+              <w:right w:val="nil"/>
+            </w:tcBorders>
+          </w:tcPr>
+          <w:p>
+            <w:pPr>
+              <w:spacing w:before="0" w:after="0"/>
+            </w:pPr>
+            <w:r>
+              <w:rPr>
+                <w:rFonts w:ascii="Segoe UI Symbol" w:hAnsi="Segoe UI Symbol"/>
+                <w:b w:val="0"/>
+                <w:color w:val="1B7F3B"/>
+                <w:sz w:val="24"/>
+              </w:rPr>
+              <w:t>☑</w:t>
+            </w:r>
+          </w:p>
+        </w:tc>
+        <w:tc>
+          <w:tcPr>
+            <w:tcW w:type="dxa" w:w="9298"/>
+            <w:tcBorders>
+              <w:top w:val="nil"/>
+              <w:left w:val="nil"/>
+              <w:bottom w:val="single" w:sz="4" w:color="E3E8EE" w:space="0"/>
+              <w:right w:val="nil"/>
+            </w:tcBorders>
+          </w:tcPr>
+          <w:p>
+            <w:pPr>
+              <w:spacing w:before="0" w:after="40"/>
+            </w:pPr>
+            <w:r>
+              <w:rPr>
+                <w:b/>
+                <w:color w:val="1A1A1A"/>
+                <w:sz w:val="19"/>
+              </w:rPr>
+              <w:t>Yes, the company is promoting environmental or social characteristics (activities, ESG policy, good ESG rating, etc)</w:t>
+            </w:r>
+          </w:p>
+          <w:p>
+            <w:pPr>
+              <w:tabs>
+                <w:tab w:pos="198" w:val="left"/>
+              </w:tabs>
+              <w:spacing w:before="0" w:after="20"/>
+              <w:ind w:left="198" w:hanging="198"/>
+            </w:pPr>
+            <w:r>
+              <w:rPr>
+                <w:b w:val="0"/>
+                <w:color w:val="5F6B7A"/>
+                <w:sz w:val="18"/>
+              </w:rPr>
+              <w:t>•</w:t>
+              <w:tab/>
+            </w:r>
+            <w:r>
+              <w:rPr>
+                <w:b w:val="0"/>
+                <w:color w:val="333333"/>
+                <w:sz w:val="18"/>
+              </w:rPr>
+              <w:t>A UK Carbon Reduction Plan (2025) and a Modern Slavery Statement (2026) are published</w:t>
+            </w:r>
+            <w:hyperlink r:id="rId12">
+              <w:r>
+                <w:rPr>
+                  <w:color w:val="2A78D6"/>
+                  <w:vertAlign w:val="superscript"/>
+                  <w:sz w:val="15"/>
+                </w:rPr>
+                <w:t xml:space="preserve">1</w:t>
+              </w:r>
+            </w:hyperlink>
+            <w:r>
+              <w:rPr>
+                <w:b w:val="0"/>
+                <w:color w:val="333333"/>
+                <w:sz w:val="18"/>
+              </w:rPr>
+              <w:t>.</w:t>
+            </w:r>
+          </w:p>
+        </w:tc>
+      </w:tr>
+    </w:tbl>
+    <w:tbl>
+      <w:tblPr>
+        <w:tblW w:w="9639" w:type="dxa"/>
+        <w:tblBorders>
+          <w:top w:val="nil"/>
+          <w:left w:val="nil"/>
+          <w:bottom w:val="nil"/>
+          <w:right w:val="nil"/>
+          <w:insideH w:val="nil"/>
+          <w:insideV w:val="nil"/>
+        </w:tblBorders>
+        <w:tblLayout w:type="fixed"/>
+        <w:tblCellMar>
+          <w:top w:w="90" w:type="dxa"/>
+          <w:left w:w="0" w:type="dxa"/>
+          <w:bottom w:w="110" w:type="dxa"/>
+          <w:right w:w="0" w:type="dxa"/>
+        </w:tblCellMar>
+        <w:tblLook w:firstColumn="1" w:firstRow="1" w:lastColumn="0" w:lastRow="0" w:noHBand="0" w:noVBand="1" w:val="04A0"/>
+      </w:tblPr>
+      <w:tblGrid>
+        <w:gridCol w:w="340"/>
+        <w:gridCol w:w="9298"/>
+      </w:tblGrid>
+      <w:tr>
+        <w:tc>
+          <w:tcPr>
+            <w:tcW w:type="dxa" w:w="340"/>
+            <w:tcBorders>
+              <w:top w:val="nil"/>
+              <w:left w:val="nil"/>
+              <w:bottom w:val="single" w:sz="4" w:color="E3E8EE" w:space="0"/>
+              <w:right w:val="nil"/>
+            </w:tcBorders>
+          </w:tcPr>
+          <w:p>
+            <w:pPr>
+              <w:spacing w:before="0" w:after="0"/>
+            </w:pPr>
+            <w:r>
+              <w:rPr>
+                <w:rFonts w:ascii="Segoe UI Symbol" w:hAnsi="Segoe UI Symbol"/>
+                <w:b w:val="0"/>
+                <w:color w:val="1B7F3B"/>
+                <w:sz w:val="24"/>
+              </w:rPr>
+              <w:t>☑</w:t>
+            </w:r>
+          </w:p>
+        </w:tc>
+        <w:tc>
+          <w:tcPr>
+            <w:tcW w:type="dxa" w:w="9298"/>
+            <w:tcBorders>
+              <w:top w:val="nil"/>
+              <w:left w:val="nil"/>
+              <w:bottom w:val="single" w:sz="4" w:color="E3E8EE" w:space="0"/>
+              <w:right w:val="nil"/>
+            </w:tcBorders>
+          </w:tcPr>
+          <w:p>
+            <w:pPr>
+              <w:spacing w:before="0" w:after="40"/>
+            </w:pPr>
+            <w:r>
+              <w:rPr>
+                <w:b/>
+                <w:color w:val="1A1A1A"/>
+                <w:sz w:val="19"/>
+              </w:rPr>
+              <w:t>Yes, the activities of the company or it’s strategy is aligned with the taxonomy and/or Paris agreement targets (e.g. net zero commitment)</w:t>
+            </w:r>
+          </w:p>
+          <w:p>
+            <w:pPr>
+              <w:tabs>
+                <w:tab w:pos="198" w:val="left"/>
+              </w:tabs>
+              <w:spacing w:before="0" w:after="20"/>
+              <w:ind w:left="198" w:hanging="198"/>
+            </w:pPr>
+            <w:r>
+              <w:rPr>
+                <w:b w:val="0"/>
+                <w:color w:val="5F6B7A"/>
+                <w:sz w:val="18"/>
+              </w:rPr>
+              <w:t>•</w:t>
+              <w:tab/>
+            </w:r>
+            <w:r>
+              <w:rPr>
+                <w:b w:val="0"/>
+                <w:color w:val="333333"/>
+                <w:sz w:val="18"/>
+              </w:rPr>
+              <w:t>A carbon reduction plan for the UK unit</w:t>
+            </w:r>
+            <w:hyperlink r:id="rId12">
+              <w:r>
+                <w:rPr>
+                  <w:color w:val="2A78D6"/>
+                  <w:vertAlign w:val="superscript"/>
+                  <w:sz w:val="15"/>
+                </w:rPr>
+                <w:t xml:space="preserve">1</w:t>
+              </w:r>
+            </w:hyperlink>
+            <w:r>
+              <w:rPr>
+                <w:b w:val="0"/>
+                <w:color w:val="333333"/>
+                <w:sz w:val="18"/>
+              </w:rPr>
+              <w:t>.</w:t>
+            </w:r>
+          </w:p>
+        </w:tc>
+      </w:tr>
+    </w:tbl>
+    <w:tbl>
+      <w:tblPr>
+        <w:tblW w:w="9639" w:type="dxa"/>
+        <w:tblBorders>
+          <w:top w:val="nil"/>
+          <w:left w:val="nil"/>
+          <w:bottom w:val="nil"/>
+          <w:right w:val="nil"/>
+          <w:insideH w:val="nil"/>
+          <w:insideV w:val="nil"/>
+        </w:tblBorders>
+        <w:tblLayout w:type="fixed"/>
+        <w:tblCellMar>
+          <w:top w:w="90" w:type="dxa"/>
+          <w:left w:w="0" w:type="dxa"/>
+          <w:bottom w:w="110" w:type="dxa"/>
+          <w:right w:w="0" w:type="dxa"/>
+        </w:tblCellMar>
+        <w:tblLook w:firstColumn="1" w:firstRow="1" w:lastColumn="0" w:lastRow="0" w:noHBand="0" w:noVBand="1" w:val="04A0"/>
+      </w:tblPr>
+      <w:tblGrid>
+        <w:gridCol w:w="340"/>
+        <w:gridCol w:w="9298"/>
+      </w:tblGrid>
+      <w:tr>
+        <w:tc>
+          <w:tcPr>
+            <w:tcW w:type="dxa" w:w="340"/>
+            <w:tcBorders>
+              <w:top w:val="nil"/>
+              <w:left w:val="nil"/>
+              <w:bottom w:val="single" w:sz="4" w:color="E3E8EE" w:space="0"/>
+              <w:right w:val="nil"/>
+            </w:tcBorders>
+          </w:tcPr>
+          <w:p>
+            <w:pPr>
+              <w:spacing w:before="0" w:after="0"/>
+            </w:pPr>
+            <w:r>
+              <w:rPr>
+                <w:rFonts w:ascii="Segoe UI Symbol" w:hAnsi="Segoe UI Symbol"/>
+                <w:b w:val="0"/>
+                <w:color w:val="1B7F3B"/>
+                <w:sz w:val="24"/>
+              </w:rPr>
+              <w:t>☑</w:t>
+            </w:r>
+          </w:p>
+        </w:tc>
+        <w:tc>
+          <w:tcPr>
+            <w:tcW w:type="dxa" w:w="9298"/>
+            <w:tcBorders>
+              <w:top w:val="nil"/>
+              <w:left w:val="nil"/>
+              <w:bottom w:val="single" w:sz="4" w:color="E3E8EE" w:space="0"/>
+              <w:right w:val="nil"/>
+            </w:tcBorders>
+          </w:tcPr>
+          <w:p>
+            <w:pPr>
+              <w:spacing w:before="0" w:after="40"/>
+            </w:pPr>
+            <w:r>
+              <w:rPr>
+                <w:b/>
+                <w:color w:val="1A1A1A"/>
+                <w:sz w:val="19"/>
+              </w:rPr>
+              <w:t>Yes, the company does not have yellow flag/signal related to controversies based on UN Global Compact or any other relevant principles/standards</w:t>
+            </w:r>
+          </w:p>
+          <w:p>
+            <w:pPr>
+              <w:tabs>
+                <w:tab w:pos="198" w:val="left"/>
+              </w:tabs>
+              <w:spacing w:before="0" w:after="20"/>
+              <w:ind w:left="198" w:hanging="198"/>
+            </w:pPr>
+            <w:r>
+              <w:rPr>
+                <w:b w:val="0"/>
+                <w:color w:val="5F6B7A"/>
+                <w:sz w:val="18"/>
+              </w:rPr>
+              <w:t>•</w:t>
+              <w:tab/>
+            </w:r>
+            <w:r>
+              <w:rPr>
+                <w:b w:val="0"/>
+                <w:color w:val="333333"/>
+                <w:sz w:val="18"/>
+              </w:rPr>
+              <w:t>No yellow flags found.</w:t>
+            </w:r>
+          </w:p>
+        </w:tc>
+      </w:tr>
+    </w:tbl>
+    <w:tbl>
+      <w:tblPr>
+        <w:tblW w:w="9639" w:type="dxa"/>
+        <w:tblBorders>
+          <w:top w:val="nil"/>
+          <w:left w:val="nil"/>
+          <w:bottom w:val="nil"/>
+          <w:right w:val="nil"/>
+          <w:insideH w:val="nil"/>
+          <w:insideV w:val="nil"/>
+        </w:tblBorders>
+        <w:tblLayout w:type="fixed"/>
+        <w:tblCellMar>
+          <w:top w:w="90" w:type="dxa"/>
+          <w:left w:w="0" w:type="dxa"/>
+          <w:bottom w:w="110" w:type="dxa"/>
+          <w:right w:w="0" w:type="dxa"/>
+        </w:tblCellMar>
+        <w:tblLook w:firstColumn="1" w:firstRow="1" w:lastColumn="0" w:lastRow="0" w:noHBand="0" w:noVBand="1" w:val="04A0"/>
+      </w:tblPr>
+      <w:tblGrid>
+        <w:gridCol w:w="340"/>
+        <w:gridCol w:w="9298"/>
+      </w:tblGrid>
+      <w:tr>
+        <w:tc>
+          <w:tcPr>
+            <w:tcW w:type="dxa" w:w="340"/>
+            <w:tcBorders>
+              <w:top w:val="nil"/>
+              <w:left w:val="nil"/>
+              <w:bottom w:val="single" w:sz="4" w:color="E3E8EE" w:space="0"/>
+              <w:right w:val="nil"/>
+            </w:tcBorders>
+          </w:tcPr>
+          <w:p>
+            <w:pPr>
+              <w:spacing w:before="0" w:after="0"/>
+            </w:pPr>
+            <w:r>
+              <w:rPr>
+                <w:rFonts w:ascii="Segoe UI Symbol" w:hAnsi="Segoe UI Symbol"/>
+                <w:b w:val="0"/>
+                <w:color w:val="1B7F3B"/>
+                <w:sz w:val="24"/>
+              </w:rPr>
+              <w:t>☑</w:t>
+            </w:r>
+          </w:p>
+        </w:tc>
+        <w:tc>
+          <w:tcPr>
+            <w:tcW w:type="dxa" w:w="9298"/>
+            <w:tcBorders>
+              <w:top w:val="nil"/>
+              <w:left w:val="nil"/>
+              <w:bottom w:val="single" w:sz="4" w:color="E3E8EE" w:space="0"/>
+              <w:right w:val="nil"/>
+            </w:tcBorders>
+          </w:tcPr>
+          <w:p>
+            <w:pPr>
+              <w:spacing w:before="0" w:after="40"/>
+            </w:pPr>
+            <w:r>
+              <w:rPr>
+                <w:b/>
+                <w:color w:val="1A1A1A"/>
+                <w:sz w:val="19"/>
+              </w:rPr>
+              <w:t>Yes, the company fulfills the expectations from SEB thematic and sector policies</w:t>
+            </w:r>
+          </w:p>
+          <w:p>
+            <w:pPr>
+              <w:spacing w:before="40" w:after="0"/>
+            </w:pPr>
+            <w:r>
+              <w:rPr>
+                <w:b/>
+                <w:color w:val="333333"/>
+                <w:sz w:val="18"/>
+              </w:rPr>
+              <w:t>Applicable</w:t>
+            </w:r>
+          </w:p>
+          <w:p>
+            <w:pPr>
+              <w:tabs>
+                <w:tab w:pos="198" w:val="left"/>
+              </w:tabs>
+              <w:spacing w:before="0" w:after="20"/>
+              <w:ind w:left="198" w:hanging="198"/>
+            </w:pPr>
+            <w:r>
+              <w:rPr>
+                <w:b w:val="0"/>
+                <w:color w:val="5F6B7A"/>
+                <w:sz w:val="18"/>
+              </w:rPr>
+              <w:t>•</w:t>
+              <w:tab/>
+            </w:r>
+            <w:r>
+              <w:rPr>
+                <w:b w:val="0"/>
+                <w:color w:val="333333"/>
+                <w:sz w:val="18"/>
+              </w:rPr>
+              <w:t>The Investments policy</w:t>
+            </w:r>
+            <w:hyperlink r:id="rId19">
+              <w:r>
+                <w:rPr>
+                  <w:color w:val="2A78D6"/>
+                  <w:vertAlign w:val="superscript"/>
+                  <w:sz w:val="15"/>
+                </w:rPr>
+                <w:t xml:space="preserve">7</w:t>
+              </w:r>
+            </w:hyperlink>
+            <w:r>
+              <w:rPr>
+                <w:b w:val="0"/>
+                <w:color w:val="333333"/>
+                <w:sz w:val="18"/>
+              </w:rPr>
+              <w:t>.</w:t>
+            </w:r>
+          </w:p>
+          <w:p>
+            <w:pPr>
+              <w:spacing w:before="40" w:after="0"/>
+            </w:pPr>
+            <w:r>
+              <w:rPr>
+                <w:b/>
+                <w:color w:val="333333"/>
+                <w:sz w:val="18"/>
+              </w:rPr>
+              <w:t>Met</w:t>
+            </w:r>
+          </w:p>
+          <w:p>
+            <w:pPr>
+              <w:tabs>
+                <w:tab w:pos="198" w:val="left"/>
+              </w:tabs>
+              <w:spacing w:before="0" w:after="20"/>
+              <w:ind w:left="198" w:hanging="198"/>
+            </w:pPr>
+            <w:r>
+              <w:rPr>
+                <w:b w:val="0"/>
+                <w:color w:val="5F6B7A"/>
+                <w:sz w:val="18"/>
+              </w:rPr>
+              <w:t>•</w:t>
+              <w:tab/>
+            </w:r>
+            <w:r>
+              <w:rPr>
+                <w:b w:val="0"/>
+                <w:color w:val="333333"/>
+                <w:sz w:val="18"/>
+              </w:rPr>
+              <w:t>ISO 27001, a modern slavery statement</w:t>
+            </w:r>
+            <w:hyperlink r:id="rId12">
+              <w:r>
+                <w:rPr>
+                  <w:color w:val="2A78D6"/>
+                  <w:vertAlign w:val="superscript"/>
+                  <w:sz w:val="15"/>
+                </w:rPr>
+                <w:t xml:space="preserve">1</w:t>
+              </w:r>
+            </w:hyperlink>
+            <w:r>
+              <w:rPr>
+                <w:b w:val="0"/>
+                <w:color w:val="333333"/>
+                <w:sz w:val="18"/>
+              </w:rPr>
+              <w:t>.</w:t>
+            </w:r>
+          </w:p>
+          <w:p>
+            <w:pPr>
+              <w:spacing w:before="40" w:after="0"/>
+            </w:pPr>
+            <w:r>
+              <w:rPr>
+                <w:b/>
+                <w:color w:val="333333"/>
+                <w:sz w:val="18"/>
+              </w:rPr>
+              <w:t>Could be improved</w:t>
+            </w:r>
+          </w:p>
+          <w:p>
+            <w:pPr>
+              <w:tabs>
+                <w:tab w:pos="198" w:val="left"/>
+              </w:tabs>
+              <w:spacing w:before="0" w:after="20"/>
+              <w:ind w:left="198" w:hanging="198"/>
+            </w:pPr>
+            <w:r>
+              <w:rPr>
+                <w:b w:val="0"/>
+                <w:color w:val="5F6B7A"/>
+                <w:sz w:val="18"/>
+              </w:rPr>
+              <w:t>•</w:t>
+              <w:tab/>
+            </w:r>
+            <w:r>
+              <w:rPr>
+                <w:b w:val="0"/>
+                <w:color w:val="333333"/>
+                <w:sz w:val="18"/>
+              </w:rPr>
+              <w:t>No group sustainability report found.</w:t>
+            </w:r>
+          </w:p>
+        </w:tc>
+      </w:tr>
+    </w:tbl>
     <w:p>
       <w:pPr>
-        <w:spacing w:before="80" w:after="20"/>
-      </w:pPr>
-      <w:r>
-        <w:rPr>
-          <w:sz w:val="24"/>
-        </w:rPr>
-        <w:t xml:space="preserve">☑ </w:t>
-      </w:r>
-      <w:r>
-        <w:t>Yes, the company is promoting environmental or social characteristics (activities, ESG policy, good ESG rating, etc)</w:t>
-      </w:r>
-    </w:p>
-    <w:p>
-      <w:pPr>
-        <w:spacing w:after="120"/>
-        <w:ind w:left="510" w:hanging="198"/>
-      </w:pPr>
-      <w:r>
-        <w:rPr>
-          <w:sz w:val="19"/>
-        </w:rPr>
-        <w:t xml:space="preserve">•  </w:t>
-      </w:r>
-      <w:r>
-        <w:rPr>
-          <w:b w:val="0"/>
-          <w:color w:val="333333"/>
-          <w:sz w:val="19"/>
-        </w:rPr>
-        <w:t>A UK Carbon Reduction Plan (2025) and a Modern Slavery Statement (2026) are published</w:t>
-      </w:r>
-      <w:hyperlink r:id="rId10">
-        <w:r>
-          <w:rPr>
-            <w:color w:val="2A78D6"/>
-            <w:vertAlign w:val="superscript"/>
-            <w:sz w:val="16"/>
-          </w:rPr>
-          <w:t xml:space="preserve">1</w:t>
-        </w:r>
-      </w:hyperlink>
-      <w:r>
-        <w:rPr>
-          <w:b w:val="0"/>
-          <w:color w:val="333333"/>
-          <w:sz w:val="19"/>
-        </w:rPr>
-        <w:t>.</w:t>
-      </w:r>
-    </w:p>
-    <w:p>
-      <w:pPr>
-        <w:spacing w:before="80" w:after="20"/>
-      </w:pPr>
-      <w:r>
-        <w:rPr>
-          <w:sz w:val="24"/>
-        </w:rPr>
-        <w:t xml:space="preserve">☑ </w:t>
-      </w:r>
-      <w:r>
-        <w:t>Yes, the activities of the company or it’s strategy is aligned with the taxonomy and/or Paris agreement targets (e.g. net zero commitment)</w:t>
-      </w:r>
-    </w:p>
-    <w:p>
-      <w:pPr>
-        <w:spacing w:after="120"/>
-        <w:ind w:left="510" w:hanging="198"/>
-      </w:pPr>
-      <w:r>
-        <w:rPr>
-          <w:sz w:val="19"/>
-        </w:rPr>
-        <w:t xml:space="preserve">•  </w:t>
-      </w:r>
-      <w:r>
-        <w:rPr>
-          <w:b w:val="0"/>
-          <w:color w:val="333333"/>
-          <w:sz w:val="19"/>
-        </w:rPr>
-        <w:t>A carbon reduction plan for the UK unit</w:t>
-      </w:r>
-      <w:hyperlink r:id="rId10">
-        <w:r>
-          <w:rPr>
-            <w:color w:val="2A78D6"/>
-            <w:vertAlign w:val="superscript"/>
-            <w:sz w:val="16"/>
-          </w:rPr>
-          <w:t xml:space="preserve">1</w:t>
-        </w:r>
-      </w:hyperlink>
-      <w:r>
-        <w:rPr>
-          <w:b w:val="0"/>
-          <w:color w:val="333333"/>
-          <w:sz w:val="19"/>
-        </w:rPr>
-        <w:t>.</w:t>
-      </w:r>
-    </w:p>
-    <w:p>
-      <w:pPr>
-        <w:spacing w:before="80" w:after="20"/>
-      </w:pPr>
-      <w:r>
-        <w:rPr>
-          <w:sz w:val="24"/>
-        </w:rPr>
-        <w:t xml:space="preserve">☑ </w:t>
-      </w:r>
-      <w:r>
-        <w:t>Yes, the company does not have yellow flag/signal related to controversies based on UN Global Compact or any other relevant principles/standards</w:t>
-      </w:r>
-    </w:p>
-    <w:p>
-      <w:pPr>
-        <w:spacing w:after="120"/>
-        <w:ind w:left="510" w:hanging="198"/>
-      </w:pPr>
-      <w:r>
-        <w:rPr>
-          <w:sz w:val="19"/>
-        </w:rPr>
-        <w:t xml:space="preserve">•  </w:t>
-      </w:r>
-      <w:r>
-        <w:rPr>
-          <w:b w:val="0"/>
-          <w:color w:val="333333"/>
-          <w:sz w:val="19"/>
-        </w:rPr>
-        <w:t>No yellow flags found.</w:t>
-      </w:r>
-    </w:p>
-    <w:p>
-      <w:pPr>
-        <w:spacing w:before="80" w:after="20"/>
-      </w:pPr>
-      <w:r>
-        <w:rPr>
-          <w:sz w:val="24"/>
-        </w:rPr>
-        <w:t xml:space="preserve">☑ </w:t>
-      </w:r>
-      <w:r>
-        <w:t>Yes, the company fulfills the expectations from SEB thematic and sector policies</w:t>
-      </w:r>
-    </w:p>
-    <w:p>
-      <w:pPr>
-        <w:spacing w:after="0"/>
-        <w:ind w:left="397"/>
+        <w:spacing w:before="120" w:after="40"/>
       </w:pPr>
       <w:r>
         <w:rPr>
           <w:b/>
-          <w:color w:val="333333"/>
           <w:sz w:val="19"/>
-        </w:rPr>
-        <w:t>Applicable</w:t>
-      </w:r>
-    </w:p>
-    <w:p>
-      <w:pPr>
-        <w:spacing w:after="0"/>
-        <w:ind w:left="737" w:hanging="198"/>
-      </w:pPr>
-      <w:r>
-        <w:rPr>
-          <w:sz w:val="19"/>
-        </w:rPr>
-        <w:t xml:space="preserve">•  </w:t>
-      </w:r>
-      <w:r>
-        <w:rPr>
-          <w:b w:val="0"/>
-          <w:color w:val="333333"/>
-          <w:sz w:val="19"/>
-        </w:rPr>
-        <w:t>The Investments policy</w:t>
-      </w:r>
-      <w:hyperlink r:id="rId17">
-        <w:r>
-          <w:rPr>
-            <w:color w:val="2A78D6"/>
-            <w:vertAlign w:val="superscript"/>
-            <w:sz w:val="16"/>
-          </w:rPr>
-          <w:t xml:space="preserve">7</w:t>
-        </w:r>
-      </w:hyperlink>
-      <w:r>
-        <w:rPr>
-          <w:b w:val="0"/>
-          <w:color w:val="333333"/>
-          <w:sz w:val="19"/>
-        </w:rPr>
-        <w:t>.</w:t>
-      </w:r>
-    </w:p>
-    <w:p>
-      <w:pPr>
-        <w:spacing w:after="0"/>
-        <w:ind w:left="397"/>
-      </w:pPr>
-      <w:r>
-        <w:rPr>
-          <w:b/>
-          <w:color w:val="333333"/>
-          <w:sz w:val="19"/>
-        </w:rPr>
-        <w:t>Met</w:t>
-      </w:r>
-    </w:p>
-    <w:p>
-      <w:pPr>
-        <w:spacing w:after="0"/>
-        <w:ind w:left="737" w:hanging="198"/>
-      </w:pPr>
-      <w:r>
-        <w:rPr>
-          <w:sz w:val="19"/>
-        </w:rPr>
-        <w:t xml:space="preserve">•  </w:t>
-      </w:r>
-      <w:r>
-        <w:rPr>
-          <w:b w:val="0"/>
-          <w:color w:val="333333"/>
-          <w:sz w:val="19"/>
-        </w:rPr>
-        <w:t>ISO 27001, a modern slavery statement</w:t>
-      </w:r>
-      <w:hyperlink r:id="rId10">
-        <w:r>
-          <w:rPr>
-            <w:color w:val="2A78D6"/>
-            <w:vertAlign w:val="superscript"/>
-            <w:sz w:val="16"/>
-          </w:rPr>
-          <w:t xml:space="preserve">1</w:t>
-        </w:r>
-      </w:hyperlink>
-      <w:r>
-        <w:rPr>
-          <w:b w:val="0"/>
-          <w:color w:val="333333"/>
-          <w:sz w:val="19"/>
-        </w:rPr>
-        <w:t>.</w:t>
-      </w:r>
-    </w:p>
-    <w:p>
-      <w:pPr>
-        <w:spacing w:after="0"/>
-        <w:ind w:left="397"/>
-      </w:pPr>
-      <w:r>
-        <w:rPr>
-          <w:b/>
-          <w:color w:val="333333"/>
-          <w:sz w:val="19"/>
-        </w:rPr>
-        <w:t>Could be improved</w:t>
-      </w:r>
-    </w:p>
-    <w:p>
-      <w:pPr>
-        <w:spacing w:after="120"/>
-        <w:ind w:left="737" w:hanging="198"/>
-      </w:pPr>
-      <w:r>
-        <w:rPr>
-          <w:sz w:val="19"/>
-        </w:rPr>
-        <w:t xml:space="preserve">•  </w:t>
-      </w:r>
-      <w:r>
-        <w:rPr>
-          <w:b w:val="0"/>
-          <w:color w:val="333333"/>
-          <w:sz w:val="19"/>
-        </w:rPr>
-        <w:t>No group sustainability report found.</w:t>
-      </w:r>
-    </w:p>
-    <w:p>
-      <w:pPr>
-        <w:spacing w:before="80"/>
-      </w:pPr>
-      <w:r>
-        <w:rPr>
-          <w:b/>
         </w:rPr>
         <w:t xml:space="preserve">Additional comments: </w:t>
       </w:r>
     </w:p>
     <w:p>
       <w:pPr>
-        <w:spacing w:before="160"/>
+        <w:keepNext/>
+        <w:shd w:val="clear" w:color="auto" w:fill="EAF1F8"/>
+        <w:spacing w:before="200" w:after="80"/>
+        <w:ind w:left="85"/>
       </w:pPr>
       <w:r>
         <w:rPr>
           <w:b/>
-          <w:sz w:val="22"/>
+          <w:caps/>
+          <w:color w:val="1F4E79"/>
+          <w:sz w:val="19"/>
         </w:rPr>
         <w:t>Engagement</w:t>
       </w:r>
     </w:p>
+    <w:tbl>
+      <w:tblPr>
+        <w:tblW w:w="9639" w:type="dxa"/>
+        <w:tblBorders>
+          <w:top w:val="nil"/>
+          <w:left w:val="nil"/>
+          <w:bottom w:val="nil"/>
+          <w:right w:val="nil"/>
+          <w:insideH w:val="nil"/>
+          <w:insideV w:val="nil"/>
+        </w:tblBorders>
+        <w:tblLayout w:type="fixed"/>
+        <w:tblCellMar>
+          <w:top w:w="90" w:type="dxa"/>
+          <w:left w:w="0" w:type="dxa"/>
+          <w:bottom w:w="110" w:type="dxa"/>
+          <w:right w:w="0" w:type="dxa"/>
+        </w:tblCellMar>
+        <w:tblLook w:firstColumn="1" w:firstRow="1" w:lastColumn="0" w:lastRow="0" w:noHBand="0" w:noVBand="1" w:val="04A0"/>
+      </w:tblPr>
+      <w:tblGrid>
+        <w:gridCol w:w="340"/>
+        <w:gridCol w:w="9298"/>
+      </w:tblGrid>
+      <w:tr>
+        <w:tc>
+          <w:tcPr>
+            <w:tcW w:type="dxa" w:w="340"/>
+            <w:tcBorders>
+              <w:top w:val="nil"/>
+              <w:left w:val="nil"/>
+              <w:bottom w:val="single" w:sz="4" w:color="E3E8EE" w:space="0"/>
+              <w:right w:val="nil"/>
+            </w:tcBorders>
+          </w:tcPr>
+          <w:p>
+            <w:pPr>
+              <w:spacing w:before="0" w:after="0"/>
+            </w:pPr>
+            <w:r>
+              <w:rPr>
+                <w:rFonts w:ascii="Segoe UI Symbol" w:hAnsi="Segoe UI Symbol"/>
+                <w:b w:val="0"/>
+                <w:color w:val="9AA5B1"/>
+                <w:sz w:val="24"/>
+              </w:rPr>
+              <w:t>☐</w:t>
+            </w:r>
+          </w:p>
+        </w:tc>
+        <w:tc>
+          <w:tcPr>
+            <w:tcW w:type="dxa" w:w="9298"/>
+            <w:tcBorders>
+              <w:top w:val="nil"/>
+              <w:left w:val="nil"/>
+              <w:bottom w:val="single" w:sz="4" w:color="E3E8EE" w:space="0"/>
+              <w:right w:val="nil"/>
+            </w:tcBorders>
+          </w:tcPr>
+          <w:p>
+            <w:pPr>
+              <w:spacing w:before="0" w:after="40"/>
+            </w:pPr>
+            <w:r>
+              <w:rPr>
+                <w:b/>
+                <w:color w:val="1A1A1A"/>
+                <w:sz w:val="19"/>
+              </w:rPr>
+              <w:t>Is there a need for pro-active engagement with the company?</w:t>
+            </w:r>
+          </w:p>
+          <w:p>
+            <w:pPr>
+              <w:tabs>
+                <w:tab w:pos="198" w:val="left"/>
+              </w:tabs>
+              <w:spacing w:before="0" w:after="20"/>
+              <w:ind w:left="198" w:hanging="198"/>
+            </w:pPr>
+            <w:r>
+              <w:rPr>
+                <w:b w:val="0"/>
+                <w:color w:val="5F6B7A"/>
+                <w:sz w:val="18"/>
+              </w:rPr>
+              <w:t>•</w:t>
+              <w:tab/>
+            </w:r>
+            <w:r>
+              <w:rPr>
+                <w:b w:val="0"/>
+                <w:color w:val="333333"/>
+                <w:sz w:val="18"/>
+              </w:rPr>
+              <w:t>No need from an ESG view.</w:t>
+            </w:r>
+          </w:p>
+        </w:tc>
+      </w:tr>
+    </w:tbl>
     <w:p>
       <w:pPr>
-        <w:spacing w:before="80" w:after="20"/>
-      </w:pPr>
-      <w:r>
-        <w:rPr>
-          <w:sz w:val="24"/>
-        </w:rPr>
-        <w:t xml:space="preserve">☐ </w:t>
-      </w:r>
-      <w:r>
-        <w:t>Is there a need for pro-active engagement with the company?</w:t>
-      </w:r>
-    </w:p>
-    <w:p>
-      <w:pPr>
-        <w:spacing w:after="120"/>
-        <w:ind w:left="510" w:hanging="198"/>
-      </w:pPr>
-      <w:r>
-        <w:rPr>
-          <w:sz w:val="19"/>
-        </w:rPr>
-        <w:t xml:space="preserve">•  </w:t>
-      </w:r>
-      <w:r>
-        <w:rPr>
-          <w:b w:val="0"/>
-          <w:color w:val="333333"/>
-          <w:sz w:val="19"/>
-        </w:rPr>
-        <w:t>No need from an ESG view.</w:t>
-      </w:r>
-    </w:p>
-    <w:p>
-      <w:pPr>
-        <w:spacing w:before="80"/>
+        <w:spacing w:before="120" w:after="40"/>
       </w:pPr>
       <w:r>
         <w:rPr>
           <w:b/>
+          <w:sz w:val="19"/>
         </w:rPr>
         <w:t xml:space="preserve">Additional comments: </w:t>
       </w:r>
     </w:p>
     <w:p>
       <w:pPr>
-        <w:spacing w:before="160"/>
+        <w:keepNext/>
+        <w:shd w:val="clear" w:color="auto" w:fill="EAF1F8"/>
+        <w:spacing w:before="200" w:after="80"/>
+        <w:ind w:left="85"/>
       </w:pPr>
       <w:r>
         <w:rPr>
           <w:b/>
-          <w:sz w:val="22"/>
+          <w:caps/>
+          <w:color w:val="1F4E79"/>
+          <w:sz w:val="19"/>
         </w:rPr>
         <w:t>Indicators</w:t>
       </w:r>
     </w:p>
+    <w:tbl>
+      <w:tblPr>
+        <w:tblW w:w="9639" w:type="dxa"/>
+        <w:tblBorders>
+          <w:top w:val="nil"/>
+          <w:left w:val="nil"/>
+          <w:bottom w:val="nil"/>
+          <w:right w:val="nil"/>
+          <w:insideH w:val="nil"/>
+          <w:insideV w:val="nil"/>
+        </w:tblBorders>
+        <w:tblLayout w:type="fixed"/>
+        <w:tblCellMar>
+          <w:top w:w="90" w:type="dxa"/>
+          <w:left w:w="0" w:type="dxa"/>
+          <w:bottom w:w="110" w:type="dxa"/>
+          <w:right w:w="0" w:type="dxa"/>
+        </w:tblCellMar>
+        <w:tblLook w:firstColumn="1" w:firstRow="1" w:lastColumn="0" w:lastRow="0" w:noHBand="0" w:noVBand="1" w:val="04A0"/>
+      </w:tblPr>
+      <w:tblGrid>
+        <w:gridCol w:w="340"/>
+        <w:gridCol w:w="9298"/>
+      </w:tblGrid>
+      <w:tr>
+        <w:tc>
+          <w:tcPr>
+            <w:tcW w:type="dxa" w:w="340"/>
+            <w:tcBorders>
+              <w:top w:val="nil"/>
+              <w:left w:val="nil"/>
+              <w:bottom w:val="single" w:sz="4" w:color="E3E8EE" w:space="0"/>
+              <w:right w:val="nil"/>
+            </w:tcBorders>
+          </w:tcPr>
+          <w:p>
+            <w:pPr>
+              <w:spacing w:before="0" w:after="0"/>
+            </w:pPr>
+            <w:r>
+              <w:rPr>
+                <w:rFonts w:ascii="Segoe UI Symbol" w:hAnsi="Segoe UI Symbol"/>
+                <w:b w:val="0"/>
+                <w:color w:val="1B7F3B"/>
+                <w:sz w:val="24"/>
+              </w:rPr>
+              <w:t>☑</w:t>
+            </w:r>
+          </w:p>
+        </w:tc>
+        <w:tc>
+          <w:tcPr>
+            <w:tcW w:type="dxa" w:w="9298"/>
+            <w:tcBorders>
+              <w:top w:val="nil"/>
+              <w:left w:val="nil"/>
+              <w:bottom w:val="single" w:sz="4" w:color="E3E8EE" w:space="0"/>
+              <w:right w:val="nil"/>
+            </w:tcBorders>
+          </w:tcPr>
+          <w:p>
+            <w:pPr>
+              <w:spacing w:before="0" w:after="40"/>
+            </w:pPr>
+            <w:r>
+              <w:rPr>
+                <w:b/>
+                <w:color w:val="1A1A1A"/>
+                <w:sz w:val="19"/>
+              </w:rPr>
+              <w:t>Yes, the indicators of the company support the targets of sustainability and PAI indicators followed by the Fund</w:t>
+            </w:r>
+          </w:p>
+          <w:p>
+            <w:pPr>
+              <w:tabs>
+                <w:tab w:pos="198" w:val="left"/>
+              </w:tabs>
+              <w:spacing w:before="0" w:after="20"/>
+              <w:ind w:left="198" w:hanging="198"/>
+            </w:pPr>
+            <w:r>
+              <w:rPr>
+                <w:b w:val="0"/>
+                <w:color w:val="5F6B7A"/>
+                <w:sz w:val="18"/>
+              </w:rPr>
+              <w:t>•</w:t>
+              <w:tab/>
+            </w:r>
+            <w:r>
+              <w:rPr>
+                <w:b w:val="0"/>
+                <w:color w:val="333333"/>
+                <w:sz w:val="18"/>
+              </w:rPr>
+              <w:t>IT services have a small environmental footprint</w:t>
+            </w:r>
+          </w:p>
+          <w:p>
+            <w:pPr>
+              <w:tabs>
+                <w:tab w:pos="198" w:val="left"/>
+              </w:tabs>
+              <w:spacing w:before="0" w:after="20"/>
+              <w:ind w:left="198" w:hanging="198"/>
+            </w:pPr>
+            <w:r>
+              <w:rPr>
+                <w:b w:val="0"/>
+                <w:color w:val="5F6B7A"/>
+                <w:sz w:val="18"/>
+              </w:rPr>
+              <w:t>•</w:t>
+              <w:tab/>
+            </w:r>
+            <w:r>
+              <w:rPr>
+                <w:b w:val="0"/>
+                <w:color w:val="333333"/>
+                <w:sz w:val="18"/>
+              </w:rPr>
+              <w:t>UK unit emission plan</w:t>
+            </w:r>
+            <w:hyperlink r:id="rId12">
+              <w:r>
+                <w:rPr>
+                  <w:color w:val="2A78D6"/>
+                  <w:vertAlign w:val="superscript"/>
+                  <w:sz w:val="15"/>
+                </w:rPr>
+                <w:t xml:space="preserve">1</w:t>
+              </w:r>
+            </w:hyperlink>
+            <w:r>
+              <w:rPr>
+                <w:b w:val="0"/>
+                <w:color w:val="333333"/>
+                <w:sz w:val="18"/>
+              </w:rPr>
+              <w:t>.</w:t>
+            </w:r>
+          </w:p>
+        </w:tc>
+      </w:tr>
+    </w:tbl>
     <w:p>
       <w:pPr>
-        <w:spacing w:before="80" w:after="20"/>
-      </w:pPr>
-      <w:r>
-        <w:rPr>
-          <w:sz w:val="24"/>
-        </w:rPr>
-        <w:t xml:space="preserve">☑ </w:t>
-      </w:r>
-      <w:r>
-        <w:t>Yes, the indicators of the company support the targets of sustainability and PAI indicators followed by the Fund</w:t>
-      </w:r>
-    </w:p>
-    <w:p>
-      <w:pPr>
-        <w:spacing w:after="0"/>
-        <w:ind w:left="510" w:hanging="198"/>
-      </w:pPr>
-      <w:r>
-        <w:rPr>
-          <w:sz w:val="19"/>
-        </w:rPr>
-        <w:t xml:space="preserve">•  </w:t>
-      </w:r>
-      <w:r>
-        <w:rPr>
-          <w:b w:val="0"/>
-          <w:color w:val="333333"/>
-          <w:sz w:val="19"/>
-        </w:rPr>
-        <w:t>IT services have a small environmental footprint</w:t>
-      </w:r>
-    </w:p>
-    <w:p>
-      <w:pPr>
-        <w:spacing w:after="120"/>
-        <w:ind w:left="510" w:hanging="198"/>
-      </w:pPr>
-      <w:r>
-        <w:rPr>
-          <w:sz w:val="19"/>
-        </w:rPr>
-        <w:t xml:space="preserve">•  </w:t>
-      </w:r>
-      <w:r>
-        <w:rPr>
-          <w:b w:val="0"/>
-          <w:color w:val="333333"/>
-          <w:sz w:val="19"/>
-        </w:rPr>
-        <w:t>UK unit emission plan</w:t>
-      </w:r>
-      <w:hyperlink r:id="rId10">
-        <w:r>
-          <w:rPr>
-            <w:color w:val="2A78D6"/>
-            <w:vertAlign w:val="superscript"/>
-            <w:sz w:val="16"/>
-          </w:rPr>
-          <w:t xml:space="preserve">1</w:t>
-        </w:r>
-      </w:hyperlink>
-      <w:r>
-        <w:rPr>
-          <w:b w:val="0"/>
-          <w:color w:val="333333"/>
-          <w:sz w:val="19"/>
-        </w:rPr>
-        <w:t>.</w:t>
-      </w:r>
-    </w:p>
-    <w:p>
-      <w:pPr>
-        <w:spacing w:before="80"/>
+        <w:spacing w:before="120" w:after="40"/>
       </w:pPr>
       <w:r>
         <w:rPr>
           <w:b/>
+          <w:sz w:val="19"/>
         </w:rPr>
         <w:t xml:space="preserve">Additional comments: </w:t>
       </w:r>
     </w:p>
     <w:p>
       <w:pPr>
-        <w:spacing w:before="80"/>
+        <w:spacing w:before="120" w:after="40"/>
       </w:pPr>
       <w:r>
         <w:rPr>
           <w:b/>
+          <w:sz w:val="19"/>
         </w:rPr>
         <w:t xml:space="preserve">Conclusion: </w:t>
       </w:r>
       <w:r>
         <w:rPr>
           <w:b w:val="0"/>
+          <w:sz w:val="19"/>
         </w:rPr>
         <w:t>No exclusions or red flags.</w:t>
       </w:r>
     </w:p>
     <w:p>
+      <w:pPr>
+        <w:spacing w:before="40" w:after="60"/>
+      </w:pPr>
       <w:r>
         <w:rPr>
-          <w:i/>
+          <w:b w:val="0"/>
           <w:color w:val="5F6B7A"/>
           <w:sz w:val="16"/>
         </w:rPr>
@@ -2148,11 +3649,24 @@
     </w:p>
     <w:p>
       <w:pPr>
-        <w:spacing w:before="280" w:after="80"/>
+        <w:keepNext/>
         <w:pBdr>
-          <w:bottom w:val="single" w:sz="6" w:color="C9D3DE" w:space="2"/>
+          <w:bottom w:val="single" w:sz="8" w:color="1F4E79" w:space="4"/>
         </w:pBdr>
+        <w:tabs>
+          <w:tab w:pos="482" w:val="left"/>
+        </w:tabs>
+        <w:spacing w:before="360" w:after="160"/>
       </w:pPr>
+      <w:r>
+        <w:rPr>
+          <w:b/>
+          <w:color w:val="2A78D6"/>
+          <w:sz w:val="18"/>
+        </w:rPr>
+        <w:t>10</w:t>
+        <w:tab/>
+      </w:r>
       <w:r>
         <w:rPr>
           <w:b/>
@@ -2164,16 +3678,22 @@
     </w:p>
     <w:p>
       <w:pPr>
-        <w:spacing w:after="20"/>
-        <w:ind w:left="340" w:hanging="340"/>
+        <w:tabs>
+          <w:tab w:pos="397" w:val="left"/>
+        </w:tabs>
+        <w:spacing w:before="0" w:after="30"/>
+        <w:ind w:left="397" w:hanging="397"/>
       </w:pPr>
       <w:r>
         <w:rPr>
+          <w:b w:val="0"/>
+          <w:color w:val="5F6B7A"/>
           <w:sz w:val="17"/>
         </w:rPr>
-        <w:t xml:space="preserve">1. </w:t>
+        <w:t>1.</w:t>
+        <w:tab/>
       </w:r>
-      <w:hyperlink r:id="rId10">
+      <w:hyperlink r:id="rId12">
         <w:r>
           <w:rPr>
             <w:color w:val="2A78D6"/>
@@ -2185,16 +3705,22 @@
     </w:p>
     <w:p>
       <w:pPr>
-        <w:spacing w:after="20"/>
-        <w:ind w:left="340" w:hanging="340"/>
+        <w:tabs>
+          <w:tab w:pos="397" w:val="left"/>
+        </w:tabs>
+        <w:spacing w:before="0" w:after="30"/>
+        <w:ind w:left="397" w:hanging="397"/>
       </w:pPr>
       <w:r>
         <w:rPr>
+          <w:b w:val="0"/>
+          <w:color w:val="5F6B7A"/>
           <w:sz w:val="17"/>
         </w:rPr>
-        <w:t xml:space="preserve">2. </w:t>
+        <w:t>2.</w:t>
+        <w:tab/>
       </w:r>
-      <w:hyperlink r:id="rId11">
+      <w:hyperlink r:id="rId13">
         <w:r>
           <w:rPr>
             <w:color w:val="2A78D6"/>
@@ -2206,16 +3732,22 @@
     </w:p>
     <w:p>
       <w:pPr>
-        <w:spacing w:after="20"/>
-        <w:ind w:left="340" w:hanging="340"/>
+        <w:tabs>
+          <w:tab w:pos="397" w:val="left"/>
+        </w:tabs>
+        <w:spacing w:before="0" w:after="30"/>
+        <w:ind w:left="397" w:hanging="397"/>
       </w:pPr>
       <w:r>
         <w:rPr>
+          <w:b w:val="0"/>
+          <w:color w:val="5F6B7A"/>
           <w:sz w:val="17"/>
         </w:rPr>
-        <w:t xml:space="preserve">3. </w:t>
+        <w:t>3.</w:t>
+        <w:tab/>
       </w:r>
-      <w:hyperlink r:id="rId12">
+      <w:hyperlink r:id="rId14">
         <w:r>
           <w:rPr>
             <w:color w:val="2A78D6"/>
@@ -2227,16 +3759,22 @@
     </w:p>
     <w:p>
       <w:pPr>
-        <w:spacing w:after="20"/>
-        <w:ind w:left="340" w:hanging="340"/>
+        <w:tabs>
+          <w:tab w:pos="397" w:val="left"/>
+        </w:tabs>
+        <w:spacing w:before="0" w:after="30"/>
+        <w:ind w:left="397" w:hanging="397"/>
       </w:pPr>
       <w:r>
         <w:rPr>
+          <w:b w:val="0"/>
+          <w:color w:val="5F6B7A"/>
           <w:sz w:val="17"/>
         </w:rPr>
-        <w:t xml:space="preserve">4. </w:t>
+        <w:t>4.</w:t>
+        <w:tab/>
       </w:r>
-      <w:hyperlink r:id="rId14">
+      <w:hyperlink r:id="rId16">
         <w:r>
           <w:rPr>
             <w:color w:val="2A78D6"/>
@@ -2248,16 +3786,22 @@
     </w:p>
     <w:p>
       <w:pPr>
-        <w:spacing w:after="20"/>
-        <w:ind w:left="340" w:hanging="340"/>
+        <w:tabs>
+          <w:tab w:pos="397" w:val="left"/>
+        </w:tabs>
+        <w:spacing w:before="0" w:after="30"/>
+        <w:ind w:left="397" w:hanging="397"/>
       </w:pPr>
       <w:r>
         <w:rPr>
+          <w:b w:val="0"/>
+          <w:color w:val="5F6B7A"/>
           <w:sz w:val="17"/>
         </w:rPr>
-        <w:t xml:space="preserve">5. </w:t>
+        <w:t>5.</w:t>
+        <w:tab/>
       </w:r>
-      <w:hyperlink r:id="rId15">
+      <w:hyperlink r:id="rId17">
         <w:r>
           <w:rPr>
             <w:color w:val="2A78D6"/>
@@ -2269,16 +3813,22 @@
     </w:p>
     <w:p>
       <w:pPr>
-        <w:spacing w:after="20"/>
-        <w:ind w:left="340" w:hanging="340"/>
+        <w:tabs>
+          <w:tab w:pos="397" w:val="left"/>
+        </w:tabs>
+        <w:spacing w:before="0" w:after="30"/>
+        <w:ind w:left="397" w:hanging="397"/>
       </w:pPr>
       <w:r>
         <w:rPr>
+          <w:b w:val="0"/>
+          <w:color w:val="5F6B7A"/>
           <w:sz w:val="17"/>
         </w:rPr>
-        <w:t xml:space="preserve">6. </w:t>
+        <w:t>6.</w:t>
+        <w:tab/>
       </w:r>
-      <w:hyperlink r:id="rId16">
+      <w:hyperlink r:id="rId18">
         <w:r>
           <w:rPr>
             <w:color w:val="2A78D6"/>
@@ -2290,16 +3840,22 @@
     </w:p>
     <w:p>
       <w:pPr>
-        <w:spacing w:after="20"/>
-        <w:ind w:left="340" w:hanging="340"/>
+        <w:tabs>
+          <w:tab w:pos="397" w:val="left"/>
+        </w:tabs>
+        <w:spacing w:before="0" w:after="30"/>
+        <w:ind w:left="397" w:hanging="397"/>
       </w:pPr>
       <w:r>
         <w:rPr>
+          <w:b w:val="0"/>
+          <w:color w:val="5F6B7A"/>
           <w:sz w:val="17"/>
         </w:rPr>
-        <w:t xml:space="preserve">7. </w:t>
+        <w:t>7.</w:t>
+        <w:tab/>
       </w:r>
-      <w:hyperlink r:id="rId17">
+      <w:hyperlink r:id="rId19">
         <w:r>
           <w:rPr>
             <w:color w:val="2A78D6"/>
@@ -2310,20 +3866,26 @@
       </w:hyperlink>
     </w:p>
     <w:p>
+      <w:pPr>
+        <w:spacing w:before="40" w:after="60"/>
+      </w:pPr>
       <w:r>
         <w:rPr>
-          <w:i/>
+          <w:b w:val="0"/>
           <w:color w:val="5F6B7A"/>
           <w:sz w:val="16"/>
         </w:rPr>
-        <w:t>Report prepared automatically from public sources. Figures are as published by the issuer; references [S#] point to the source list. Items marked for review must be checked by the analyst before use.</w:t>
+        <w:t>Report prepared from public sources. Figures are as published by the issuer; small numbers next to the text point to the source list.</w:t>
       </w:r>
     </w:p>
     <w:sectPr>
-      <w:footerReference w:type="default" r:id="rId9"/>
-      <w:pgSz w:w="12240" w:h="15840"/>
-      <w:pgMar w:top="907" w:right="1134" w:bottom="907" w:left="1134" w:header="720" w:footer="720" w:gutter="0"/>
+      <w:headerReference w:type="default" r:id="rId9"/>
+      <w:footerReference w:type="default" r:id="rId10"/>
+      <w:footerReference w:type="first" r:id="rId11"/>
+      <w:pgSz w:w="11906" w:h="16838"/>
+      <w:pgMar w:top="1020" w:right="1134" w:bottom="1020" w:left="1134" w:header="510" w:footer="454" w:gutter="0"/>
       <w:cols w:space="720"/>
+      <w:titlePg/>
       <w:docGrid w:linePitch="360"/>
     </w:sectPr>
   </w:body>
@@ -2334,19 +3896,100 @@
 <w:ftr xmlns:m="http://schemas.openxmlformats.org/officeDocument/2006/math" xmlns:mc="http://schemas.openxmlformats.org/markup-compatibility/2006" xmlns:mo="http://schemas.microsoft.com/office/mac/office/2008/main" xmlns:mv="urn:schemas-microsoft-com:mac:vml" xmlns:o="urn:schemas-microsoft-com:office:office" xmlns:r="http://schemas.openxmlformats.org/officeDocument/2006/relationships" xmlns:v="urn:schemas-microsoft-com:vml" xmlns:w10="urn:schemas-microsoft-com:office:word" xmlns:w14="http://schemas.microsoft.com/office/word/2010/wordml" xmlns:w="http://schemas.openxmlformats.org/wordprocessingml/2006/main" xmlns:wne="http://schemas.microsoft.com/office/word/2006/wordml" xmlns:wp14="http://schemas.microsoft.com/office/word/2010/wordprocessingDrawing" xmlns:wp="http://schemas.openxmlformats.org/drawingml/2006/wordprocessingDrawing" xmlns:wpc="http://schemas.microsoft.com/office/word/2010/wordprocessingCanvas" xmlns:wpg="http://schemas.microsoft.com/office/word/2010/wordprocessingGroup" xmlns:wpi="http://schemas.microsoft.com/office/word/2010/wordprocessingInk" xmlns:wps="http://schemas.microsoft.com/office/word/2010/wordprocessingShape" mc:Ignorable="w14 wp14">
   <w:p>
     <w:pPr>
-      <w:pStyle w:val="Footer"/>
-      <w:jc w:val="right"/>
+      <w:pBdr>
+        <w:top w:val="single" w:sz="4" w:color="C9D3DE" w:space="4"/>
+      </w:pBdr>
+      <w:tabs>
+        <w:tab w:pos="9638" w:val="right"/>
+      </w:tabs>
     </w:pPr>
     <w:r>
       <w:rPr>
+        <w:b w:val="0"/>
         <w:color w:val="5F6B7A"/>
         <w:sz w:val="16"/>
       </w:rPr>
-      <w:t xml:space="preserve">Nortal · FY2025 · 2026-10-22   ·   </w:t>
+      <w:t>Nortal · FY2025 · 2026-10-22</w:t>
+      <w:tab/>
     </w:r>
-    <w:fldSimple w:instr="PAGE"/>
+    <w:r>
+      <w:rPr>
+        <w:b/>
+        <w:color w:val="1F4E79"/>
+        <w:sz w:val="16"/>
+      </w:rPr>
+      <w:fldChar w:fldCharType="begin"/>
+      <w:instrText xml:space="preserve"> PAGE </w:instrText>
+      <w:fldChar w:fldCharType="end"/>
+    </w:r>
   </w:p>
 </w:ftr>
+</file>
+
+<file path=word/footer2.xml><?xml version="1.0" encoding="utf-8"?>
+<w:ftr xmlns:m="http://schemas.openxmlformats.org/officeDocument/2006/math" xmlns:mc="http://schemas.openxmlformats.org/markup-compatibility/2006" xmlns:mo="http://schemas.microsoft.com/office/mac/office/2008/main" xmlns:mv="urn:schemas-microsoft-com:mac:vml" xmlns:o="urn:schemas-microsoft-com:office:office" xmlns:r="http://schemas.openxmlformats.org/officeDocument/2006/relationships" xmlns:v="urn:schemas-microsoft-com:vml" xmlns:w10="urn:schemas-microsoft-com:office:word" xmlns:w14="http://schemas.microsoft.com/office/word/2010/wordml" xmlns:w="http://schemas.openxmlformats.org/wordprocessingml/2006/main" xmlns:wne="http://schemas.microsoft.com/office/word/2006/wordml" xmlns:wp14="http://schemas.microsoft.com/office/word/2010/wordprocessingDrawing" xmlns:wp="http://schemas.openxmlformats.org/drawingml/2006/wordprocessingDrawing" xmlns:wpc="http://schemas.microsoft.com/office/word/2010/wordprocessingCanvas" xmlns:wpg="http://schemas.microsoft.com/office/word/2010/wordprocessingGroup" xmlns:wpi="http://schemas.microsoft.com/office/word/2010/wordprocessingInk" xmlns:wps="http://schemas.microsoft.com/office/word/2010/wordprocessingShape" mc:Ignorable="w14 wp14">
+  <w:p>
+    <w:pPr>
+      <w:pBdr>
+        <w:top w:val="single" w:sz="4" w:color="C9D3DE" w:space="4"/>
+      </w:pBdr>
+      <w:tabs>
+        <w:tab w:pos="9638" w:val="right"/>
+      </w:tabs>
+    </w:pPr>
+    <w:r>
+      <w:rPr>
+        <w:b w:val="0"/>
+        <w:color w:val="5F6B7A"/>
+        <w:sz w:val="16"/>
+      </w:rPr>
+      <w:t>Nortal · FY2025 · 2026-10-22</w:t>
+      <w:tab/>
+    </w:r>
+    <w:r>
+      <w:rPr>
+        <w:b/>
+        <w:color w:val="1F4E79"/>
+        <w:sz w:val="16"/>
+      </w:rPr>
+      <w:fldChar w:fldCharType="begin"/>
+      <w:instrText xml:space="preserve"> PAGE </w:instrText>
+      <w:fldChar w:fldCharType="end"/>
+    </w:r>
+  </w:p>
+</w:ftr>
+</file>
+
+<file path=word/header1.xml><?xml version="1.0" encoding="utf-8"?>
+<w:hdr xmlns:m="http://schemas.openxmlformats.org/officeDocument/2006/math" xmlns:mc="http://schemas.openxmlformats.org/markup-compatibility/2006" xmlns:mo="http://schemas.microsoft.com/office/mac/office/2008/main" xmlns:mv="urn:schemas-microsoft-com:mac:vml" xmlns:o="urn:schemas-microsoft-com:office:office" xmlns:r="http://schemas.openxmlformats.org/officeDocument/2006/relationships" xmlns:v="urn:schemas-microsoft-com:vml" xmlns:w10="urn:schemas-microsoft-com:office:word" xmlns:w14="http://schemas.microsoft.com/office/word/2010/wordml" xmlns:w="http://schemas.openxmlformats.org/wordprocessingml/2006/main" xmlns:wne="http://schemas.microsoft.com/office/word/2006/wordml" xmlns:wp14="http://schemas.microsoft.com/office/word/2010/wordprocessingDrawing" xmlns:wp="http://schemas.openxmlformats.org/drawingml/2006/wordprocessingDrawing" xmlns:wpc="http://schemas.microsoft.com/office/word/2010/wordprocessingCanvas" xmlns:wpg="http://schemas.microsoft.com/office/word/2010/wordprocessingGroup" xmlns:wpi="http://schemas.microsoft.com/office/word/2010/wordprocessingInk" xmlns:wps="http://schemas.microsoft.com/office/word/2010/wordprocessingShape" mc:Ignorable="w14 wp14">
+  <w:p>
+    <w:pPr>
+      <w:pBdr>
+        <w:bottom w:val="single" w:sz="4" w:color="C9D3DE" w:space="4"/>
+      </w:pBdr>
+      <w:tabs>
+        <w:tab w:pos="9638" w:val="right"/>
+      </w:tabs>
+    </w:pPr>
+    <w:r>
+      <w:rPr>
+        <w:b/>
+        <w:color w:val="1F4E79"/>
+        <w:sz w:val="16"/>
+      </w:rPr>
+      <w:t>Nortal</w:t>
+    </w:r>
+    <w:r>
+      <w:rPr>
+        <w:b w:val="0"/>
+        <w:color w:val="5F6B7A"/>
+        <w:sz w:val="16"/>
+      </w:rPr>
+      <w:tab/>
+      <w:t>Issuer review · FY2025</w:t>
+    </w:r>
+  </w:p>
+</w:hdr>
 </file>
 
 <file path=word/numbering.xml><?xml version="1.0" encoding="utf-8"?>
@@ -2713,10 +4356,10 @@
     <w:qFormat/>
     <w:rsid w:val="00FC693F"/>
     <w:pPr>
-      <w:spacing w:after="80"/>
+      <w:spacing w:after="80" w:line="264" w:lineRule="auto"/>
     </w:pPr>
     <w:rPr>
-      <w:rFonts w:ascii="Calibri" w:hAnsi="Calibri"/>
+      <w:rFonts w:ascii="Calibri" w:hAnsi="Calibri" w:eastAsia="Calibri"/>
       <w:color w:val="1A1A1A"/>
       <w:sz w:val="21"/>
     </w:rPr>

</xml_diff>